<commit_message>
Record Orphanet J Rare Dis general submission guidelines; draft header and number format adapted
Co-Authored-By: Claude Sonnet 5.5 <noreply@anthropic.com>
Claude-Session: https://claude.ai/code/session_01FRD7etKqYN8v2bbXeeLMRW
</commit_message>
<xml_diff>
--- a/Manuscript draft - systematic review with IPD (v0.1).docx
+++ b/Manuscript draft - systematic review with IPD (v0.1).docx
@@ -71,7 +71,21 @@
         <w:rPr>
           <w:rFonts w:ascii="Calibri" w:cs="Calibri" w:eastAsia="Microsoft YaHei" w:hAnsi="Calibri"/>
         </w:rPr>
-        <w:t xml:space="preserve">. The target journal is Orphanet Journal of Rare Diseases; its author guidelines have not been read (the page could not be opened from the working environment), so the structure below is the generic BMC layout and must be checked against the journal's instructions before submission.</w:t>
+        <w:t xml:space="preserve">. The target journal is Orphanet Journal of Rare Diseases. Its general submission guidelines (23-page PDF supplied by the authors on 17 October 2026) have been read and are summarised in the project notes; numbers are therefore written without thousands separators (journal rule for tables and values), and tables and figures must later be rebuilt without colour or shading, with titles of at most 15 words and legends of at most 300 words, double line spacing, and line and page numbers. </w:t>
+      </w:r>
+      <w:r>
+        <w:rPr>
+          <w:rFonts w:ascii="Calibri" w:cs="Calibri" w:eastAsia="Microsoft YaHei" w:hAnsi="Calibri"/>
+          <w:b/>
+          <w:bCs/>
+        </w:rPr>
+        <w:t xml:space="preserve">The PDF did not contain the pages for the Review and Research article types, so the abstract structure, word limits, section headings and the list of required declarations are still unknown; the structure below is the generic BMC layout and is provisional until those pages are read.</w:t>
+      </w:r>
+      <w:r>
+        <w:rPr>
+          <w:rFonts w:ascii="Calibri" w:cs="Calibri" w:eastAsia="Microsoft YaHei" w:hAnsi="Calibri"/>
+        </w:rPr>
+        <w:t xml:space="preserve"> The journal accepts reviews on specific rare diseases but not case reports that only present phenotype information; the paper is therefore framed as a systematic review, and the five institutional patients are one data source within it.</w:t>
       </w:r>
     </w:p>
     <w:p>
@@ -721,7 +735,7 @@
                 <w:sz w:val="20"/>
                 <w:szCs w:val="20"/>
               </w:rPr>
-              <w:t xml:space="preserve">1,263</w:t>
+              <w:t xml:space="preserve">1263</w:t>
             </w:r>
           </w:p>
         </w:tc>
@@ -949,7 +963,7 @@
                 <w:sz w:val="20"/>
                 <w:szCs w:val="20"/>
               </w:rPr>
-              <w:t xml:space="preserve">1,563</w:t>
+              <w:t xml:space="preserve">1563</w:t>
             </w:r>
           </w:p>
         </w:tc>
@@ -1387,7 +1401,7 @@
                 <w:sz w:val="20"/>
                 <w:szCs w:val="20"/>
               </w:rPr>
-              <w:t xml:space="preserve">4,906</w:t>
+              <w:t xml:space="preserve">4906</w:t>
             </w:r>
           </w:p>
         </w:tc>
@@ -1437,18 +1451,18 @@
         <w:rPr>
           <w:rFonts w:ascii="Calibri" w:cs="Calibri" w:eastAsia="Microsoft YaHei" w:hAnsi="Calibri"/>
         </w:rPr>
-        <w:t xml:space="preserve">Records were deduplicated with a documented rule-based script (identical DOI; identical title with the same first author and year; similar title with the same first author; same first author, year, volume and first page; and further rules for Chinese-language records and differently written author names). EndNote's duplicate finder was then run on the result as a check, and nothing beyond known distinct publications and patents was flagged. Of 4,906 records, 2,358 duplicates were removed and 2,548 records were screened.</w:t>
-      </w:r>
-    </w:p>
-    <w:p>
-      <w:pPr>
-        <w:spacing w:after="120"/>
-      </w:pPr>
-      <w:r>
-        <w:rPr>
-          <w:rFonts w:ascii="Calibri" w:cs="Calibri" w:eastAsia="Microsoft YaHei" w:hAnsi="Calibri"/>
-        </w:rPr>
-        <w:t xml:space="preserve">Screening was done in Rayyan with blind mode on and author and journal details hidden. Two reviewers (JS and FP) were to screen titles and abstracts independently against the eligibility criteria, using a written screening guide that applies the criteria without changing them: when in doubt, Maybe; every Exclude carries one of six fixed reasons; records without an abstract are rated Maybe or Exclude only. Before formal screening, the reviewers screened a random calibration sample of 50 of the 2,548 records and agreed on 45 of them (90.0%; Cohen's kappa 0.83); all five disagreements were among the 11 records without an abstract. Author and journal details were visible to both reviewers during part of the calibration. According to the protocol, Rayyan's artificial-intelligence functions and its automatic duplicate handling were not to be used. Disagreements in which one reviewer excluded and the other did not were to be resolved by the adjudicator (JY) from an exported list outside Rayyan.</w:t>
+        <w:t xml:space="preserve">Records were deduplicated with a documented rule-based script (identical DOI; identical title with the same first author and year; similar title with the same first author; same first author, year, volume and first page; and further rules for Chinese-language records and differently written author names). EndNote's duplicate finder was then run on the result as a check, and nothing beyond known distinct publications and patents was flagged. Of 4906 records, 2358 duplicates were removed and 2548 records were screened.</w:t>
+      </w:r>
+    </w:p>
+    <w:p>
+      <w:pPr>
+        <w:spacing w:after="120"/>
+      </w:pPr>
+      <w:r>
+        <w:rPr>
+          <w:rFonts w:ascii="Calibri" w:cs="Calibri" w:eastAsia="Microsoft YaHei" w:hAnsi="Calibri"/>
+        </w:rPr>
+        <w:t xml:space="preserve">Screening was done in Rayyan with blind mode on and author and journal details hidden. Two reviewers (JS and FP) were to screen titles and abstracts independently against the eligibility criteria, using a written screening guide that applies the criteria without changing them: when in doubt, Maybe; every Exclude carries one of six fixed reasons; records without an abstract are rated Maybe or Exclude only. Before formal screening, the reviewers screened a random calibration sample of 50 of the 2548 records and agreed on 45 of them (90.0%; Cohen's kappa 0.83); all five disagreements were among the 11 records without an abstract. Author and journal details were visible to both reviewers during part of the calibration. According to the protocol, Rayyan's artificial-intelligence functions and its automatic duplicate handling were not to be used. Disagreements in which one reviewer excluded and the other did not were to be resolved by the adjudicator (JY) from an exported list outside Rayyan.</w:t>
       </w:r>
     </w:p>
     <w:p>
@@ -1467,7 +1481,7 @@
         <w:rPr>
           <w:rFonts w:ascii="Calibri" w:cs="Calibri" w:eastAsia="Microsoft YaHei" w:hAnsi="Calibri"/>
         </w:rPr>
-        <w:t xml:space="preserve"> The decisions of the second reviewer in the formal screening were, according to the project log, entered in two ways that need an explanation before the stage can be described as two independent reviews: (1) on 10 and 11 October 2026 about 93% of the second reviewer's decisions were entered at a median of 1.9 seconds per record with bulk operations, and the second reviewer reported that an AI coding agent (Codex) was used; (2) in a repeat screening of all 2,548 records on 17 October 2026 the decisions were entered at a median of 0.45 seconds per record, a speed at which reading each title and abstract at the time of entry is not possible, while the authors report that no AI was used and that the records were read as they were clicked. The first reviewer's decisions were entered at a human pace (median 9.4 seconds per record). The accurate account, the handling of these decisions and any change to the reviewer arrangement must be decided by the authors, recorded in the PROSPERO amendment, and then written here. Source: project log and </w:t>
+        <w:t xml:space="preserve"> The decisions of the second reviewer in the formal screening were, according to the project log, entered in two ways that need an explanation before the stage can be described as two independent reviews: (1) on 10 and 11 October 2026 about 93% of the second reviewer's decisions were entered at a median of 1.9 seconds per record with bulk operations, and the second reviewer reported that an AI coding agent (Codex) was used; (2) in a repeat screening of all 2548 records on 17 October 2026 the decisions were entered at a median of 0.45 seconds per record, a speed at which reading each title and abstract at the time of entry is not possible, while the authors report that no AI was used and that the records were read as they were clicked. The first reviewer's decisions were entered at a human pace (median 9.4 seconds per record). The accurate account, the handling of these decisions and any change to the reviewer arrangement must be decided by the authors, recorded in the PROSPERO amendment, and then written here. Source: project log and </w:t>
       </w:r>
       <w:r>
         <w:rPr>
@@ -1873,7 +1887,7 @@
         <w:rPr>
           <w:rFonts w:ascii="Calibri" w:cs="Calibri" w:eastAsia="Microsoft YaHei" w:hAnsi="Calibri"/>
         </w:rPr>
-        <w:t xml:space="preserve">A total of 4,906 records were identified from six databases; 2,358 duplicates were removed, and 2,548 records were screened. </w:t>
+        <w:t xml:space="preserve">A total of 4906 records were identified from six databases; 2358 duplicates were removed, and 2548 records were screened. </w:t>
       </w:r>
       <w:r>
         <w:rPr>

</xml_diff>

<commit_message>
Record Orphanet J Rare Dis Research and Review pages; draft follows journal headings and declarations
Co-Authored-By: Claude Sonnet 5.5 <noreply@anthropic.com>
Claude-Session: https://claude.ai/code/session_01FRD7etKqYN8v2bbXeeLMRW
</commit_message>
<xml_diff>
--- a/Manuscript draft - systematic review with IPD (v0.1).docx
+++ b/Manuscript draft - systematic review with IPD (v0.1).docx
@@ -71,21 +71,35 @@
         <w:rPr>
           <w:rFonts w:ascii="Calibri" w:cs="Calibri" w:eastAsia="Microsoft YaHei" w:hAnsi="Calibri"/>
         </w:rPr>
-        <w:t xml:space="preserve">. The target journal is Orphanet Journal of Rare Diseases. Its general submission guidelines (23-page PDF supplied by the authors on 17 October 2026) have been read and are summarised in the project notes; numbers are therefore written without thousands separators (journal rule for tables and values), and tables and figures must later be rebuilt without colour or shading, with titles of at most 15 words and legends of at most 300 words, double line spacing, and line and page numbers. </w:t>
-      </w:r>
-      <w:r>
-        <w:rPr>
-          <w:rFonts w:ascii="Calibri" w:cs="Calibri" w:eastAsia="Microsoft YaHei" w:hAnsi="Calibri"/>
-          <w:b/>
-          <w:bCs/>
-        </w:rPr>
-        <w:t xml:space="preserve">The PDF did not contain the pages for the Review and Research article types, so the abstract structure, word limits, section headings and the list of required declarations are still unknown; the structure below is the generic BMC layout and is provisional until those pages are read.</w:t>
-      </w:r>
-      <w:r>
-        <w:rPr>
-          <w:rFonts w:ascii="Calibri" w:cs="Calibri" w:eastAsia="Microsoft YaHei" w:hAnsi="Calibri"/>
-        </w:rPr>
-        <w:t xml:space="preserve"> The journal accepts reviews on specific rare diseases but not case reports that only present phenotype information; the paper is therefore framed as a systematic review, and the five institutional patients are one data source within it.</w:t>
+        <w:t xml:space="preserve">. The target journal is Orphanet Journal of Rare Diseases. The general submission guidelines and the journal's pages for the Research and Review article types (three PDFs supplied by the authors on 17 October 2026) have been read, and the layout below follows them: the abstract has at most 350 words and no references, the main text runs Background, Methods, Results, Discussion, Conclusions, List of abbreviations and Declarations, and the Declarations carry the journal's seven compulsory headings. Numbers are written without thousands separators (journal rule for tables and values). Tables and figures must later be rebuilt without colour or shading, with titles of at most 15 words and legends of at most 300 words, and the submission file needs double line spacing, line numbers and page numbers. </w:t>
+      </w:r>
+      <w:r>
+        <w:rPr>
+          <w:rFonts w:ascii="Calibri" w:cs="Calibri" w:eastAsia="Microsoft YaHei" w:hAnsi="Calibri"/>
+          <w:b/>
+          <w:bCs/>
+        </w:rPr>
+        <w:t xml:space="preserve">Article type (recommendation, to be decided by the authors; the editor has the final say):</w:t>
+      </w:r>
+      <w:r>
+        <w:rPr>
+          <w:rFonts w:ascii="Calibri" w:cs="Calibri" w:eastAsia="Microsoft YaHei" w:hAnsi="Calibri"/>
+        </w:rPr>
+        <w:t xml:space="preserve"> Research rather than Review, because the paper is a pre-registered analysis of pooled individual patient data with its own Methods and Results, whereas the journal describes a Review as a comprehensive, authoritative description of a subject. </w:t>
+      </w:r>
+      <w:r>
+        <w:rPr>
+          <w:rFonts w:ascii="Calibri" w:cs="Calibri" w:eastAsia="Microsoft YaHei" w:hAnsi="Calibri"/>
+          <w:b/>
+          <w:bCs/>
+        </w:rPr>
+        <w:t xml:space="preserve">Not stated on the pages read:</w:t>
+      </w:r>
+      <w:r>
+        <w:rPr>
+          <w:rFonts w:ascii="Calibri" w:cs="Calibri" w:eastAsia="Microsoft YaHei" w:hAnsi="Calibri"/>
+        </w:rPr>
+        <w:t xml:space="preserve"> any word limit for the main text, and any limit on the number of tables and figures. The journal accepts reviews on specific rare diseases but not case reports that only present phenotype information; the paper is therefore framed as a systematic review, and the five institutional patients are one data source within it.</w:t>
       </w:r>
     </w:p>
     <w:p>
@@ -466,7 +480,7 @@
         <w:rPr>
           <w:rFonts w:ascii="Calibri" w:cs="Calibri" w:eastAsia="Microsoft YaHei" w:hAnsi="Calibri"/>
         </w:rPr>
-        <w:t xml:space="preserve">We searched MEDLINE via PubMed, Web of Science Core Collection, Scopus, China National Knowledge Infrastructure (CNKI), Wanfang Data and the China Biology Medicine database (CBM, via SinoMed). Strategies combined controlled vocabulary, where it exists, with free-text synonyms for wandering spleen, splenic torsion and splenopexy, with no limits on language, date, age or study design, and were reviewed by a medical librarian before the searches were run. The searches were run by one author (JS) on 28 and 29 September 2026 (Table 1). The full strategies and the search log follow PRISMA-S [12] and are given in Supplementary File 1.</w:t>
+        <w:t xml:space="preserve">We searched MEDLINE via PubMed, Web of Science Core Collection, Scopus, China National Knowledge Infrastructure (CNKI), Wanfang Data and the China Biology Medicine database (CBM, via SinoMed). Strategies combined controlled vocabulary, where it exists, with free-text synonyms for wandering spleen, splenic torsion and splenopexy, with no limits on language, date, age or study design, and were reviewed by a medical librarian before the searches were run. The searches were run by one author (JS) on 28 and 29 September 2026 (Table 1). The full strategies and the search log follow PRISMA-S [12] and are given in Additional file 1.</w:t>
       </w:r>
     </w:p>
     <w:p>
@@ -1540,7 +1554,7 @@
         <w:rPr>
           <w:rFonts w:ascii="Calibri" w:cs="Calibri" w:eastAsia="Microsoft YaHei" w:hAnsi="Calibri"/>
         </w:rPr>
-        <w:t xml:space="preserve">Two reviewers were to extract data independently for every included patient with a pre-specified form (Supplementary File 2) after calibration on 10 reports, and agreement on the primary exposure and the primary outcome was to be reported as Cohen's kappa. Where a report described patients only in aggregate, the corresponding author was to be emailed twice, four weeks apart, to request individual data; otherwise the report would be described narratively. Duplicate reports of the same patients were identified by matching institution, study period, age, sex and clinical details, and the most complete report was used. </w:t>
+        <w:t xml:space="preserve">Two reviewers were to extract data independently for every included patient with a pre-specified form (Additional file 2) after calibration on 10 reports, and agreement on the primary exposure and the primary outcome was to be reported as Cohen's kappa. Where a report described patients only in aggregate, the corresponding author was to be emailed twice, four weeks apart, to request individual data; otherwise the report would be described narratively. Duplicate reports of the same patients were identified by matching institution, study period, age, sex and clinical details, and the most complete report was used. </w:t>
       </w:r>
       <w:r>
         <w:rPr>
@@ -1585,7 +1599,7 @@
         <w:rPr>
           <w:rFonts w:ascii="Calibri" w:cs="Calibri" w:eastAsia="Microsoft YaHei" w:hAnsi="Calibri"/>
         </w:rPr>
-        <w:t xml:space="preserve"> was the duration of the index symptomatic episode: the time from the onset of the symptoms of the presentation that led to operation until the operation, in days. Time in hospital before operation during the same admission counted; a planned interval between discharge and a scheduled elective operation did not and was recorded separately as a waiting interval. Rules for converting reported durations are given in Supplementary File 2.</w:t>
+        <w:t xml:space="preserve"> was the duration of the index symptomatic episode: the time from the onset of the symptoms of the presentation that led to operation until the operation, in days. Time in hospital before operation during the same admission counted; a planned interval between discharge and a scheduled elective operation did not and was recorded separately as a waiting interval. Rules for converting reported durations are given in Additional file 2.</w:t>
       </w:r>
     </w:p>
     <w:p>
@@ -1844,6 +1858,31 @@
     </w:p>
     <w:p>
       <w:pPr>
+        <w:pStyle w:val="Heading3"/>
+        <w:keepNext/>
+      </w:pPr>
+      <w:r>
+        <w:rPr>
+          <w:rFonts w:ascii="Calibri" w:cs="Calibri" w:eastAsia="Microsoft YaHei" w:hAnsi="Calibri"/>
+        </w:rPr>
+        <w:t xml:space="preserve">Use of artificial intelligence tools</w:t>
+      </w:r>
+    </w:p>
+    <w:p>
+      <w:pPr>
+        <w:spacing w:after="120"/>
+      </w:pPr>
+      <w:r>
+        <w:rPr>
+          <w:rFonts w:ascii="Calibri" w:cs="Calibri" w:eastAsia="Microsoft YaHei" w:hAnsi="Calibri"/>
+          <w:b/>
+          <w:bCs/>
+        </w:rPr>
+        <w:t xml:space="preserve">[PENDING: the journal requires that any use of a large language model be documented in the Methods. The authors must state which tools were used, for what, and by whom. Facts recorded in the project log that the statement has to cover: (1) in the first round of title and abstract screening on 10 and 11 October 2026, the second reviewer's account made most of its decisions with an AI coding agent (Codex), contrary to the written screening guide; those decisions were kept as a separate dataset and not used; (2) Claude Code (Anthropic) was used to write and run the scripts for deduplication, screening comparison and process checks, to prepare the extraction workbook and the screening guides, and to draft this manuscript from the protocol and the project logs. Whether and how the authors checked the AI-assisted work, and the wording of the statement, are for the authors to decide.]</w:t>
+      </w:r>
+    </w:p>
+    <w:p>
+      <w:pPr>
         <w:pStyle w:val="Heading2"/>
         <w:keepNext/>
       </w:pPr>
@@ -2281,7 +2320,497 @@
         <w:rPr>
           <w:rFonts w:ascii="Calibri" w:cs="Calibri" w:eastAsia="Microsoft YaHei" w:hAnsi="Calibri"/>
         </w:rPr>
+        <w:t xml:space="preserve">List of abbreviations</w:t>
+      </w:r>
+    </w:p>
+    <w:p>
+      <w:pPr>
+        <w:spacing w:after="120"/>
+      </w:pPr>
+      <w:r>
+        <w:rPr>
+          <w:rFonts w:ascii="Calibri" w:cs="Calibri" w:eastAsia="Microsoft YaHei" w:hAnsi="Calibri"/>
+        </w:rPr>
+        <w:t xml:space="preserve">CBM: China Biology Medicine database; CNKI: China National Knowledge Infrastructure; GRADE: Grading of Recommendations Assessment, Development and Evaluation; IPD: individual patient data; PRISMA: Preferred Reporting Items for Systematic Reviews and Meta-Analyses; PRISMA-IPD: PRISMA extension for individual participant data; PRISMA-S: PRISMA extension for literature searches; PROSPERO: International Prospective Register of Systematic Reviews. </w:t>
+      </w:r>
+      <w:r>
+        <w:rPr>
+          <w:rFonts w:ascii="Calibri" w:cs="Calibri" w:eastAsia="Microsoft YaHei" w:hAnsi="Calibri"/>
+          <w:b/>
+          <w:bCs/>
+        </w:rPr>
+        <w:t xml:space="preserve">[PENDING: revise when the text is final.]</w:t>
+      </w:r>
+    </w:p>
+    <w:p>
+      <w:pPr>
+        <w:pStyle w:val="Heading2"/>
+        <w:keepNext/>
+      </w:pPr>
+      <w:r>
+        <w:rPr>
+          <w:rFonts w:ascii="Calibri" w:cs="Calibri" w:eastAsia="Microsoft YaHei" w:hAnsi="Calibri"/>
+        </w:rPr>
         <w:t xml:space="preserve">Declarations</w:t>
+      </w:r>
+    </w:p>
+    <w:p>
+      <w:pPr>
+        <w:spacing w:after="120"/>
+      </w:pPr>
+      <w:r>
+        <w:rPr>
+          <w:rFonts w:ascii="Calibri" w:cs="Calibri" w:eastAsia="Microsoft YaHei" w:hAnsi="Calibri"/>
+          <w:b/>
+          <w:bCs/>
+        </w:rPr>
+        <w:t xml:space="preserve">Ethics approval and consent to participate.</w:t>
+      </w:r>
+      <w:r>
+        <w:rPr>
+          <w:rFonts w:ascii="Calibri" w:cs="Calibri" w:eastAsia="Microsoft YaHei" w:hAnsi="Calibri"/>
+        </w:rPr>
+        <w:t xml:space="preserve"> The systematic review used data from published reports only. The institutional series was approved by the ethics committee of Wuhan Children's Hospital (reference 2025R156-E01), with a supplementary approval covering the fifth patient. </w:t>
+      </w:r>
+      <w:r>
+        <w:rPr>
+          <w:rFonts w:ascii="Calibri" w:cs="Calibri" w:eastAsia="Microsoft YaHei" w:hAnsi="Calibri"/>
+          <w:b/>
+          <w:bCs/>
+        </w:rPr>
+        <w:t xml:space="preserve">[PENDING: confirm the name of the committee as it must appear, whether the supplementary approval carries its own reference number, and the wording on consent to participate.]</w:t>
+      </w:r>
+    </w:p>
+    <w:p>
+      <w:pPr>
+        <w:spacing w:after="120"/>
+      </w:pPr>
+      <w:r>
+        <w:rPr>
+          <w:rFonts w:ascii="Calibri" w:cs="Calibri" w:eastAsia="Microsoft YaHei" w:hAnsi="Calibri"/>
+          <w:b/>
+          <w:bCs/>
+        </w:rPr>
+        <w:t xml:space="preserve">Consent for publication.</w:t>
+      </w:r>
+      <w:r>
+        <w:rPr>
+          <w:rFonts w:ascii="Calibri" w:cs="Calibri" w:eastAsia="Microsoft YaHei" w:hAnsi="Calibri"/>
+        </w:rPr>
+        <w:t xml:space="preserve"> </w:t>
+      </w:r>
+      <w:r>
+        <w:rPr>
+          <w:rFonts w:ascii="Calibri" w:cs="Calibri" w:eastAsia="Microsoft YaHei" w:hAnsi="Calibri"/>
+          <w:b/>
+          <w:bCs/>
+        </w:rPr>
+        <w:t xml:space="preserve">[PENDING: written consent for publication of clinical details and images from the parents or legal guardians of all five children. The journal asks that consent forms are not sent at submission but may be requested at any stage.]</w:t>
+      </w:r>
+    </w:p>
+    <w:p>
+      <w:pPr>
+        <w:spacing w:after="120"/>
+      </w:pPr>
+      <w:r>
+        <w:rPr>
+          <w:rFonts w:ascii="Calibri" w:cs="Calibri" w:eastAsia="Microsoft YaHei" w:hAnsi="Calibri"/>
+          <w:b/>
+          <w:bCs/>
+        </w:rPr>
+        <w:t xml:space="preserve">Availability of data and materials.</w:t>
+      </w:r>
+      <w:r>
+        <w:rPr>
+          <w:rFonts w:ascii="Calibri" w:cs="Calibri" w:eastAsia="Microsoft YaHei" w:hAnsi="Calibri"/>
+        </w:rPr>
+        <w:t xml:space="preserve"> </w:t>
+      </w:r>
+      <w:r>
+        <w:rPr>
+          <w:rFonts w:ascii="Calibri" w:cs="Calibri" w:eastAsia="Microsoft YaHei" w:hAnsi="Calibri"/>
+          <w:b/>
+          <w:bCs/>
+        </w:rPr>
+        <w:t xml:space="preserve">[PENDING: choose the route. The journal's wording for a repository is "The datasets generated and/or analysed during the current study are available in the [NAME] repository, [PERSISTENT WEB LINK TO DATASETS]"; for data inside the article and its additional files, "All data generated or analysed during this study are included in this published article [and its supplementary information files]"; where privacy could be compromised, the reason and the conditions of access must be stated. The journal's additional-file rules say that no individual participant details may be included, and it is not established whether a de-identified patient-level table counts as such; ask the editorial office before deciding between a public repository and an additional file. The journal also encourages depositing the search strings on searchRxiv and citing the dataset in the reference list with a persistent identifier.]</w:t>
+      </w:r>
+    </w:p>
+    <w:p>
+      <w:pPr>
+        <w:spacing w:after="120"/>
+      </w:pPr>
+      <w:r>
+        <w:rPr>
+          <w:rFonts w:ascii="Calibri" w:cs="Calibri" w:eastAsia="Microsoft YaHei" w:hAnsi="Calibri"/>
+          <w:b/>
+          <w:bCs/>
+        </w:rPr>
+        <w:t xml:space="preserve">Competing interests.</w:t>
+      </w:r>
+      <w:r>
+        <w:rPr>
+          <w:rFonts w:ascii="Calibri" w:cs="Calibri" w:eastAsia="Microsoft YaHei" w:hAnsi="Calibri"/>
+        </w:rPr>
+        <w:t xml:space="preserve"> The authors declare that they have no competing interests. </w:t>
+      </w:r>
+      <w:r>
+        <w:rPr>
+          <w:rFonts w:ascii="Calibri" w:cs="Calibri" w:eastAsia="Microsoft YaHei" w:hAnsi="Calibri"/>
+          <w:b/>
+          <w:bCs/>
+        </w:rPr>
+        <w:t xml:space="preserve">[PENDING: confirm with all authors.]</w:t>
+      </w:r>
+    </w:p>
+    <w:p>
+      <w:pPr>
+        <w:spacing w:after="120"/>
+      </w:pPr>
+      <w:r>
+        <w:rPr>
+          <w:rFonts w:ascii="Calibri" w:cs="Calibri" w:eastAsia="Microsoft YaHei" w:hAnsi="Calibri"/>
+          <w:b/>
+          <w:bCs/>
+        </w:rPr>
+        <w:t xml:space="preserve">Funding.</w:t>
+      </w:r>
+      <w:r>
+        <w:rPr>
+          <w:rFonts w:ascii="Calibri" w:cs="Calibri" w:eastAsia="Microsoft YaHei" w:hAnsi="Calibri"/>
+        </w:rPr>
+        <w:t xml:space="preserve"> None. </w:t>
+      </w:r>
+      <w:r>
+        <w:rPr>
+          <w:rFonts w:ascii="Calibri" w:cs="Calibri" w:eastAsia="Microsoft YaHei" w:hAnsi="Calibri"/>
+          <w:b/>
+          <w:bCs/>
+        </w:rPr>
+        <w:t xml:space="preserve">[PENDING: confirm with all authors.]</w:t>
+      </w:r>
+    </w:p>
+    <w:p>
+      <w:pPr>
+        <w:spacing w:after="120"/>
+      </w:pPr>
+      <w:r>
+        <w:rPr>
+          <w:rFonts w:ascii="Calibri" w:cs="Calibri" w:eastAsia="Microsoft YaHei" w:hAnsi="Calibri"/>
+          <w:b/>
+          <w:bCs/>
+        </w:rPr>
+        <w:t xml:space="preserve">Authors' contributions.</w:t>
+      </w:r>
+      <w:r>
+        <w:rPr>
+          <w:rFonts w:ascii="Calibri" w:cs="Calibri" w:eastAsia="Microsoft YaHei" w:hAnsi="Calibri"/>
+        </w:rPr>
+        <w:t xml:space="preserve"> </w:t>
+      </w:r>
+      <w:r>
+        <w:rPr>
+          <w:rFonts w:ascii="Calibri" w:cs="Calibri" w:eastAsia="Microsoft YaHei" w:hAnsi="Calibri"/>
+          <w:b/>
+          <w:bCs/>
+        </w:rPr>
+        <w:t xml:space="preserve">[PENDING: to be written by the authors, referring to each author by initials, ending with "All authors read and approved the final manuscript." Contributions of the second reviewer of the title and abstract stage and of any author added since registration must be included.]</w:t>
+      </w:r>
+    </w:p>
+    <w:p>
+      <w:pPr>
+        <w:spacing w:after="120"/>
+      </w:pPr>
+      <w:r>
+        <w:rPr>
+          <w:rFonts w:ascii="Calibri" w:cs="Calibri" w:eastAsia="Microsoft YaHei" w:hAnsi="Calibri"/>
+          <w:b/>
+          <w:bCs/>
+        </w:rPr>
+        <w:t xml:space="preserve">Acknowledgements.</w:t>
+      </w:r>
+      <w:r>
+        <w:rPr>
+          <w:rFonts w:ascii="Calibri" w:cs="Calibri" w:eastAsia="Microsoft YaHei" w:hAnsi="Calibri"/>
+        </w:rPr>
+        <w:t xml:space="preserve"> The medical librarian who reviewed the search strategies. </w:t>
+      </w:r>
+      <w:r>
+        <w:rPr>
+          <w:rFonts w:ascii="Calibri" w:cs="Calibri" w:eastAsia="Microsoft YaHei" w:hAnsi="Calibri"/>
+          <w:b/>
+          <w:bCs/>
+        </w:rPr>
+        <w:t xml:space="preserve">[PENDING: name, and permission of the person named, which the journal requires.]</w:t>
+      </w:r>
+    </w:p>
+    <w:p>
+      <w:pPr>
+        <w:spacing w:after="120"/>
+      </w:pPr>
+      <w:r>
+        <w:rPr>
+          <w:rFonts w:ascii="Calibri" w:cs="Calibri" w:eastAsia="Microsoft YaHei" w:hAnsi="Calibri"/>
+          <w:b/>
+          <w:bCs/>
+        </w:rPr>
+        <w:t xml:space="preserve">Authors' information.</w:t>
+      </w:r>
+      <w:r>
+        <w:rPr>
+          <w:rFonts w:ascii="Calibri" w:cs="Calibri" w:eastAsia="Microsoft YaHei" w:hAnsi="Calibri"/>
+        </w:rPr>
+        <w:t xml:space="preserve"> Not applicable. </w:t>
+      </w:r>
+      <w:r>
+        <w:rPr>
+          <w:rFonts w:ascii="Calibri" w:cs="Calibri" w:eastAsia="Microsoft YaHei" w:hAnsi="Calibri"/>
+          <w:b/>
+          <w:bCs/>
+        </w:rPr>
+        <w:t xml:space="preserve">[Optional section.]</w:t>
+      </w:r>
+    </w:p>
+    <w:p>
+      <w:pPr>
+        <w:pStyle w:val="Heading2"/>
+        <w:keepNext/>
+      </w:pPr>
+      <w:r>
+        <w:rPr>
+          <w:rFonts w:ascii="Calibri" w:cs="Calibri" w:eastAsia="Microsoft YaHei" w:hAnsi="Calibri"/>
+        </w:rPr>
+        <w:t xml:space="preserve">References</w:t>
+      </w:r>
+    </w:p>
+    <w:p>
+      <w:pPr>
+        <w:pStyle w:val="ListParagraph"/>
+        <w:numPr>
+          <w:ilvl w:val="0"/>
+          <w:numId w:val="3"/>
+        </w:numPr>
+        <w:spacing w:after="60"/>
+      </w:pPr>
+      <w:r>
+        <w:rPr>
+          <w:rFonts w:ascii="Calibri" w:cs="Calibri" w:eastAsia="Microsoft YaHei" w:hAnsi="Calibri"/>
+        </w:rPr>
+        <w:t xml:space="preserve">Ganarin A, Fascetti Leon F, La Pergola E, Gamba P. Surgical approach of wandering spleen in infants and children: a systematic review. J Laparoendosc Adv Surg Tech A. 2021. doi:10.1089/lap.2020.0759</w:t>
+      </w:r>
+    </w:p>
+    <w:p>
+      <w:pPr>
+        <w:pStyle w:val="ListParagraph"/>
+        <w:numPr>
+          <w:ilvl w:val="0"/>
+          <w:numId w:val="3"/>
+        </w:numPr>
+        <w:spacing w:after="60"/>
+      </w:pPr>
+      <w:r>
+        <w:rPr>
+          <w:rFonts w:ascii="Calibri" w:cs="Calibri" w:eastAsia="Microsoft YaHei" w:hAnsi="Calibri"/>
+        </w:rPr>
+        <w:t xml:space="preserve">Allen KB, Andrews G. Pediatric wandering spleen—the case for splenopexy: review of 35 reported cases in the literature. J Pediatr Surg. 1989;24:432-5.</w:t>
+      </w:r>
+    </w:p>
+    <w:p>
+      <w:pPr>
+        <w:pStyle w:val="ListParagraph"/>
+        <w:numPr>
+          <w:ilvl w:val="0"/>
+          <w:numId w:val="3"/>
+        </w:numPr>
+        <w:spacing w:after="60"/>
+      </w:pPr>
+      <w:r>
+        <w:rPr>
+          <w:rFonts w:ascii="Calibri" w:cs="Calibri" w:eastAsia="Microsoft YaHei" w:hAnsi="Calibri"/>
+        </w:rPr>
+        <w:t xml:space="preserve">Brown CVR, Virgilio GR, Vazquez WD. Wandering spleen and its complications in children: a case series and review of the literature. J Pediatr Surg. 2003;38:1676-9.</w:t>
+      </w:r>
+    </w:p>
+    <w:p>
+      <w:pPr>
+        <w:pStyle w:val="ListParagraph"/>
+        <w:numPr>
+          <w:ilvl w:val="0"/>
+          <w:numId w:val="3"/>
+        </w:numPr>
+        <w:spacing w:after="60"/>
+      </w:pPr>
+      <w:r>
+        <w:rPr>
+          <w:rFonts w:ascii="Calibri" w:cs="Calibri" w:eastAsia="Microsoft YaHei" w:hAnsi="Calibri"/>
+        </w:rPr>
+        <w:t xml:space="preserve">Soleimani M, Mehrabi A, Kashfi A, et al. Surgical treatment of patients with wandering spleen: report of six cases with a review of the literature. Surg Today. 2007;37:261-9.</w:t>
+      </w:r>
+    </w:p>
+    <w:p>
+      <w:pPr>
+        <w:pStyle w:val="ListParagraph"/>
+        <w:numPr>
+          <w:ilvl w:val="0"/>
+          <w:numId w:val="3"/>
+        </w:numPr>
+        <w:spacing w:after="60"/>
+      </w:pPr>
+      <w:r>
+        <w:rPr>
+          <w:rFonts w:ascii="Calibri" w:cs="Calibri" w:eastAsia="Microsoft YaHei" w:hAnsi="Calibri"/>
+        </w:rPr>
+        <w:t xml:space="preserve">Fiquet-Francois C, Belouadah M, Ludot H, et al. Wandering spleen in children: multicenter retrospective study. J Pediatr Surg. 2010;45:1519-24.</w:t>
+      </w:r>
+    </w:p>
+    <w:p>
+      <w:pPr>
+        <w:pStyle w:val="ListParagraph"/>
+        <w:numPr>
+          <w:ilvl w:val="0"/>
+          <w:numId w:val="3"/>
+        </w:numPr>
+        <w:spacing w:after="60"/>
+      </w:pPr>
+      <w:r>
+        <w:rPr>
+          <w:rFonts w:ascii="Calibri" w:cs="Calibri" w:eastAsia="Microsoft YaHei" w:hAnsi="Calibri"/>
+        </w:rPr>
+        <w:t xml:space="preserve">Lombardi R, Menchini L, Corneli T, et al. Wandering spleen in children: a report of 3 cases and a brief literature review underlining the importance of diagnostic imaging. Pediatr Radiol. 2014. doi:10.1007/s00247-013-2851-6</w:t>
+      </w:r>
+    </w:p>
+    <w:p>
+      <w:pPr>
+        <w:pStyle w:val="ListParagraph"/>
+        <w:numPr>
+          <w:ilvl w:val="0"/>
+          <w:numId w:val="3"/>
+        </w:numPr>
+        <w:spacing w:after="60"/>
+      </w:pPr>
+      <w:r>
+        <w:rPr>
+          <w:rFonts w:ascii="Calibri" w:cs="Calibri" w:eastAsia="Microsoft YaHei" w:hAnsi="Calibri"/>
+        </w:rPr>
+        <w:t xml:space="preserve">Alqadi GO, Saxena AK. Is laparoscopic approach for wandering spleen in children an option? J Minim Access Surg. 2019;15:93-7.</w:t>
+      </w:r>
+    </w:p>
+    <w:p>
+      <w:pPr>
+        <w:pStyle w:val="ListParagraph"/>
+        <w:numPr>
+          <w:ilvl w:val="0"/>
+          <w:numId w:val="3"/>
+        </w:numPr>
+        <w:spacing w:after="60"/>
+      </w:pPr>
+      <w:r>
+        <w:rPr>
+          <w:rFonts w:ascii="Calibri" w:cs="Calibri" w:eastAsia="Microsoft YaHei" w:hAnsi="Calibri"/>
+        </w:rPr>
+        <w:t xml:space="preserve">Barabino M, Luigiano C, Pellicano R, et al. "Wandering spleen" as a rare cause of recurrent abdominal pain: a systematic review. Minerva Chir. 2019;74:359-63.</w:t>
+      </w:r>
+    </w:p>
+    <w:p>
+      <w:pPr>
+        <w:pStyle w:val="ListParagraph"/>
+        <w:numPr>
+          <w:ilvl w:val="0"/>
+          <w:numId w:val="3"/>
+        </w:numPr>
+        <w:spacing w:after="60"/>
+      </w:pPr>
+      <w:r>
+        <w:rPr>
+          <w:rFonts w:ascii="Calibri" w:cs="Calibri" w:eastAsia="Microsoft YaHei" w:hAnsi="Calibri"/>
+        </w:rPr>
+        <w:t xml:space="preserve">Moore E, O'Brien JW, Merali N, et al. Gastric outlet obstruction secondary to a wandering spleen: systematic review and surgical management of a case. Ann R Coll Surg Engl. 2023;105:501-6.</w:t>
+      </w:r>
+    </w:p>
+    <w:p>
+      <w:pPr>
+        <w:pStyle w:val="ListParagraph"/>
+        <w:numPr>
+          <w:ilvl w:val="0"/>
+          <w:numId w:val="3"/>
+        </w:numPr>
+        <w:spacing w:after="60"/>
+      </w:pPr>
+      <w:r>
+        <w:rPr>
+          <w:rFonts w:ascii="Calibri" w:cs="Calibri" w:eastAsia="Microsoft YaHei" w:hAnsi="Calibri"/>
+        </w:rPr>
+        <w:t xml:space="preserve">Page MJ, McKenzie JE, Bossuyt PM, et al. The PRISMA 2020 statement: an updated guideline for reporting systematic reviews. BMJ. 2021;372:n71.</w:t>
+      </w:r>
+    </w:p>
+    <w:p>
+      <w:pPr>
+        <w:pStyle w:val="ListParagraph"/>
+        <w:numPr>
+          <w:ilvl w:val="0"/>
+          <w:numId w:val="3"/>
+        </w:numPr>
+        <w:spacing w:after="60"/>
+      </w:pPr>
+      <w:r>
+        <w:rPr>
+          <w:rFonts w:ascii="Calibri" w:cs="Calibri" w:eastAsia="Microsoft YaHei" w:hAnsi="Calibri"/>
+        </w:rPr>
+        <w:t xml:space="preserve">Stewart LA, Clarke M, Rovers M, et al. Preferred reporting items for a systematic review and meta-analysis of individual participant data: the PRISMA-IPD statement. JAMA. 2015;313:1657-65.</w:t>
+      </w:r>
+    </w:p>
+    <w:p>
+      <w:pPr>
+        <w:pStyle w:val="ListParagraph"/>
+        <w:numPr>
+          <w:ilvl w:val="0"/>
+          <w:numId w:val="3"/>
+        </w:numPr>
+        <w:spacing w:after="60"/>
+      </w:pPr>
+      <w:r>
+        <w:rPr>
+          <w:rFonts w:ascii="Calibri" w:cs="Calibri" w:eastAsia="Microsoft YaHei" w:hAnsi="Calibri"/>
+        </w:rPr>
+        <w:t xml:space="preserve">Rethlefsen ML, Kirtley S, Waffenschmidt S, et al. PRISMA-S: an extension to the PRISMA Statement for Reporting Literature Searches in Systematic Reviews. Syst Rev. 2021;10:39.</w:t>
+      </w:r>
+    </w:p>
+    <w:p>
+      <w:pPr>
+        <w:pStyle w:val="ListParagraph"/>
+        <w:numPr>
+          <w:ilvl w:val="0"/>
+          <w:numId w:val="3"/>
+        </w:numPr>
+        <w:spacing w:after="60"/>
+      </w:pPr>
+      <w:r>
+        <w:rPr>
+          <w:rFonts w:ascii="Calibri" w:cs="Calibri" w:eastAsia="Microsoft YaHei" w:hAnsi="Calibri"/>
+        </w:rPr>
+        <w:t xml:space="preserve">Murad MH, Sultan S, Haffar S, Bazerbachi F. Methodological quality and synthesis of case series and case reports. BMJ Evid Based Med. 2018;23:60-3.</w:t>
+      </w:r>
+    </w:p>
+    <w:p>
+      <w:pPr>
+        <w:pStyle w:val="Heading2"/>
+        <w:keepNext/>
+      </w:pPr>
+      <w:r>
+        <w:rPr>
+          <w:rFonts w:ascii="Calibri" w:cs="Calibri" w:eastAsia="Microsoft YaHei" w:hAnsi="Calibri"/>
+        </w:rPr>
+        <w:t xml:space="preserve">Additional files (planned)</w:t>
+      </w:r>
+    </w:p>
+    <w:p>
+      <w:pPr>
+        <w:spacing w:after="120"/>
+      </w:pPr>
+      <w:r>
+        <w:rPr>
+          <w:rFonts w:ascii="Calibri" w:cs="Calibri" w:eastAsia="Microsoft YaHei" w:hAnsi="Calibri"/>
+        </w:rPr>
+        <w:t xml:space="preserve">The journal asks for each additional file to be named "Additional file 1" and so on, cited in sequence in the text, and listed with file name, format, title and description; files may not exceed 20 MB each and may not contain individual participant details.</w:t>
       </w:r>
     </w:p>
     <w:p>
@@ -2296,24 +2825,8 @@
       <w:r>
         <w:rPr>
           <w:rFonts w:ascii="Calibri" w:cs="Calibri" w:eastAsia="Microsoft YaHei" w:hAnsi="Calibri"/>
-          <w:b/>
-          <w:bCs/>
-        </w:rPr>
-        <w:t xml:space="preserve">Ethics approval and consent to participate.</w:t>
-      </w:r>
-      <w:r>
-        <w:rPr>
-          <w:rFonts w:ascii="Calibri" w:cs="Calibri" w:eastAsia="Microsoft YaHei" w:hAnsi="Calibri"/>
-        </w:rPr>
-        <w:t xml:space="preserve"> Wuhan Children's Hospital ethics committee, approval 2025R156-E01, supplemented to cover the fifth patient. </w:t>
-      </w:r>
-      <w:r>
-        <w:rPr>
-          <w:rFonts w:ascii="Calibri" w:cs="Calibri" w:eastAsia="Microsoft YaHei" w:hAnsi="Calibri"/>
-          <w:b/>
-          <w:bCs/>
-        </w:rPr>
-        <w:t xml:space="preserve">[PENDING: confirm.]</w:t>
+        </w:rPr>
+        <w:t xml:space="preserve">Additional file 1 (format to be decided): search strategies for each database and the search log (PRISMA-S).</w:t>
       </w:r>
     </w:p>
     <w:p>
@@ -2328,24 +2841,8 @@
       <w:r>
         <w:rPr>
           <w:rFonts w:ascii="Calibri" w:cs="Calibri" w:eastAsia="Microsoft YaHei" w:hAnsi="Calibri"/>
-          <w:b/>
-          <w:bCs/>
-        </w:rPr>
-        <w:t xml:space="preserve">Consent for publication.</w:t>
-      </w:r>
-      <w:r>
-        <w:rPr>
-          <w:rFonts w:ascii="Calibri" w:cs="Calibri" w:eastAsia="Microsoft YaHei" w:hAnsi="Calibri"/>
-        </w:rPr>
-        <w:t xml:space="preserve"> </w:t>
-      </w:r>
-      <w:r>
-        <w:rPr>
-          <w:rFonts w:ascii="Calibri" w:cs="Calibri" w:eastAsia="Microsoft YaHei" w:hAnsi="Calibri"/>
-          <w:b/>
-          <w:bCs/>
-        </w:rPr>
-        <w:t xml:space="preserve">[PENDING: written consent from the parents of all five children for clinical details and images.]</w:t>
+        </w:rPr>
+        <w:t xml:space="preserve">Additional file 2 (.xlsx): data-extraction form and coding rules, including the duration-conversion rules.</w:t>
       </w:r>
     </w:p>
     <w:p>
@@ -2360,24 +2857,8 @@
       <w:r>
         <w:rPr>
           <w:rFonts w:ascii="Calibri" w:cs="Calibri" w:eastAsia="Microsoft YaHei" w:hAnsi="Calibri"/>
-          <w:b/>
-          <w:bCs/>
-        </w:rPr>
-        <w:t xml:space="preserve">Availability of data and materials.</w:t>
-      </w:r>
-      <w:r>
-        <w:rPr>
-          <w:rFonts w:ascii="Calibri" w:cs="Calibri" w:eastAsia="Microsoft YaHei" w:hAnsi="Calibri"/>
-        </w:rPr>
-        <w:t xml:space="preserve"> The full individual patient dataset extracted from the included reports, the extraction form, the search strategies and the search log will be provided as supplementary files. No patient-identifying information is included. </w:t>
-      </w:r>
-      <w:r>
-        <w:rPr>
-          <w:rFonts w:ascii="Calibri" w:cs="Calibri" w:eastAsia="Microsoft YaHei" w:hAnsi="Calibri"/>
-          <w:b/>
-          <w:bCs/>
-        </w:rPr>
-        <w:t xml:space="preserve">[PENDING: confirm.]</w:t>
+        </w:rPr>
+        <w:t xml:space="preserve">Additional file 3: the individual patient dataset (route and format pending, see Availability of data and materials).</w:t>
       </w:r>
     </w:p>
     <w:p>
@@ -2392,400 +2873,8 @@
       <w:r>
         <w:rPr>
           <w:rFonts w:ascii="Calibri" w:cs="Calibri" w:eastAsia="Microsoft YaHei" w:hAnsi="Calibri"/>
-          <w:b/>
-          <w:bCs/>
-        </w:rPr>
-        <w:t xml:space="preserve">Competing interests.</w:t>
-      </w:r>
-      <w:r>
-        <w:rPr>
-          <w:rFonts w:ascii="Calibri" w:cs="Calibri" w:eastAsia="Microsoft YaHei" w:hAnsi="Calibri"/>
-        </w:rPr>
-        <w:t xml:space="preserve"> None known.</w:t>
-      </w:r>
-    </w:p>
-    <w:p>
-      <w:pPr>
-        <w:pStyle w:val="ListParagraph"/>
-        <w:numPr>
-          <w:ilvl w:val="0"/>
-          <w:numId w:val="2"/>
-        </w:numPr>
-        <w:spacing w:after="60"/>
-      </w:pPr>
-      <w:r>
-        <w:rPr>
-          <w:rFonts w:ascii="Calibri" w:cs="Calibri" w:eastAsia="Microsoft YaHei" w:hAnsi="Calibri"/>
-          <w:b/>
-          <w:bCs/>
-        </w:rPr>
-        <w:t xml:space="preserve">Funding.</w:t>
-      </w:r>
-      <w:r>
-        <w:rPr>
-          <w:rFonts w:ascii="Calibri" w:cs="Calibri" w:eastAsia="Microsoft YaHei" w:hAnsi="Calibri"/>
-        </w:rPr>
-        <w:t xml:space="preserve"> None.</w:t>
-      </w:r>
-    </w:p>
-    <w:p>
-      <w:pPr>
-        <w:pStyle w:val="ListParagraph"/>
-        <w:numPr>
-          <w:ilvl w:val="0"/>
-          <w:numId w:val="2"/>
-        </w:numPr>
-        <w:spacing w:after="60"/>
-      </w:pPr>
-      <w:r>
-        <w:rPr>
-          <w:rFonts w:ascii="Calibri" w:cs="Calibri" w:eastAsia="Microsoft YaHei" w:hAnsi="Calibri"/>
-          <w:b/>
-          <w:bCs/>
-        </w:rPr>
-        <w:t xml:space="preserve">Authors' contributions.</w:t>
-      </w:r>
-      <w:r>
-        <w:rPr>
-          <w:rFonts w:ascii="Calibri" w:cs="Calibri" w:eastAsia="Microsoft YaHei" w:hAnsi="Calibri"/>
-        </w:rPr>
-        <w:t xml:space="preserve"> </w:t>
-      </w:r>
-      <w:r>
-        <w:rPr>
-          <w:rFonts w:ascii="Calibri" w:cs="Calibri" w:eastAsia="Microsoft YaHei" w:hAnsi="Calibri"/>
-          <w:b/>
-          <w:bCs/>
-        </w:rPr>
-        <w:t xml:space="preserve">[PENDING: to be written by the authors.]</w:t>
-      </w:r>
-    </w:p>
-    <w:p>
-      <w:pPr>
-        <w:pStyle w:val="ListParagraph"/>
-        <w:numPr>
-          <w:ilvl w:val="0"/>
-          <w:numId w:val="2"/>
-        </w:numPr>
-        <w:spacing w:after="60"/>
-      </w:pPr>
-      <w:r>
-        <w:rPr>
-          <w:rFonts w:ascii="Calibri" w:cs="Calibri" w:eastAsia="Microsoft YaHei" w:hAnsi="Calibri"/>
-          <w:b/>
-          <w:bCs/>
-        </w:rPr>
-        <w:t xml:space="preserve">Acknowledgements.</w:t>
-      </w:r>
-      <w:r>
-        <w:rPr>
-          <w:rFonts w:ascii="Calibri" w:cs="Calibri" w:eastAsia="Microsoft YaHei" w:hAnsi="Calibri"/>
-        </w:rPr>
-        <w:t xml:space="preserve"> The medical librarian who reviewed the search strategies. </w:t>
-      </w:r>
-      <w:r>
-        <w:rPr>
-          <w:rFonts w:ascii="Calibri" w:cs="Calibri" w:eastAsia="Microsoft YaHei" w:hAnsi="Calibri"/>
-          <w:b/>
-          <w:bCs/>
-        </w:rPr>
-        <w:t xml:space="preserve">[PENDING: name and permission.]</w:t>
-      </w:r>
-    </w:p>
-    <w:p>
-      <w:pPr>
-        <w:pStyle w:val="Heading2"/>
-        <w:keepNext/>
-      </w:pPr>
-      <w:r>
-        <w:rPr>
-          <w:rFonts w:ascii="Calibri" w:cs="Calibri" w:eastAsia="Microsoft YaHei" w:hAnsi="Calibri"/>
-        </w:rPr>
-        <w:t xml:space="preserve">References</w:t>
-      </w:r>
-    </w:p>
-    <w:p>
-      <w:pPr>
-        <w:pStyle w:val="ListParagraph"/>
-        <w:numPr>
-          <w:ilvl w:val="0"/>
-          <w:numId w:val="3"/>
-        </w:numPr>
-        <w:spacing w:after="60"/>
-      </w:pPr>
-      <w:r>
-        <w:rPr>
-          <w:rFonts w:ascii="Calibri" w:cs="Calibri" w:eastAsia="Microsoft YaHei" w:hAnsi="Calibri"/>
-        </w:rPr>
-        <w:t xml:space="preserve">Ganarin A, Fascetti Leon F, La Pergola E, Gamba P. Surgical approach of wandering spleen in infants and children: a systematic review. J Laparoendosc Adv Surg Tech A. 2021. doi:10.1089/lap.2020.0759</w:t>
-      </w:r>
-    </w:p>
-    <w:p>
-      <w:pPr>
-        <w:pStyle w:val="ListParagraph"/>
-        <w:numPr>
-          <w:ilvl w:val="0"/>
-          <w:numId w:val="3"/>
-        </w:numPr>
-        <w:spacing w:after="60"/>
-      </w:pPr>
-      <w:r>
-        <w:rPr>
-          <w:rFonts w:ascii="Calibri" w:cs="Calibri" w:eastAsia="Microsoft YaHei" w:hAnsi="Calibri"/>
-        </w:rPr>
-        <w:t xml:space="preserve">Allen KB, Andrews G. Pediatric wandering spleen—the case for splenopexy: review of 35 reported cases in the literature. J Pediatr Surg. 1989;24:432–5.</w:t>
-      </w:r>
-    </w:p>
-    <w:p>
-      <w:pPr>
-        <w:pStyle w:val="ListParagraph"/>
-        <w:numPr>
-          <w:ilvl w:val="0"/>
-          <w:numId w:val="3"/>
-        </w:numPr>
-        <w:spacing w:after="60"/>
-      </w:pPr>
-      <w:r>
-        <w:rPr>
-          <w:rFonts w:ascii="Calibri" w:cs="Calibri" w:eastAsia="Microsoft YaHei" w:hAnsi="Calibri"/>
-        </w:rPr>
-        <w:t xml:space="preserve">Brown CVR, Virgilio GR, Vazquez WD. Wandering spleen and its complications in children: a case series and review of the literature. J Pediatr Surg. 2003;38:1676–9.</w:t>
-      </w:r>
-    </w:p>
-    <w:p>
-      <w:pPr>
-        <w:pStyle w:val="ListParagraph"/>
-        <w:numPr>
-          <w:ilvl w:val="0"/>
-          <w:numId w:val="3"/>
-        </w:numPr>
-        <w:spacing w:after="60"/>
-      </w:pPr>
-      <w:r>
-        <w:rPr>
-          <w:rFonts w:ascii="Calibri" w:cs="Calibri" w:eastAsia="Microsoft YaHei" w:hAnsi="Calibri"/>
-        </w:rPr>
-        <w:t xml:space="preserve">Soleimani M, Mehrabi A, Kashfi A, et al. Surgical treatment of patients with wandering spleen: report of six cases with a review of the literature. Surg Today. 2007;37:261–9.</w:t>
-      </w:r>
-    </w:p>
-    <w:p>
-      <w:pPr>
-        <w:pStyle w:val="ListParagraph"/>
-        <w:numPr>
-          <w:ilvl w:val="0"/>
-          <w:numId w:val="3"/>
-        </w:numPr>
-        <w:spacing w:after="60"/>
-      </w:pPr>
-      <w:r>
-        <w:rPr>
-          <w:rFonts w:ascii="Calibri" w:cs="Calibri" w:eastAsia="Microsoft YaHei" w:hAnsi="Calibri"/>
-        </w:rPr>
-        <w:t xml:space="preserve">Fiquet-Francois C, Belouadah M, Ludot H, et al. Wandering spleen in children: multicenter retrospective study. J Pediatr Surg. 2010;45:1519–24.</w:t>
-      </w:r>
-    </w:p>
-    <w:p>
-      <w:pPr>
-        <w:pStyle w:val="ListParagraph"/>
-        <w:numPr>
-          <w:ilvl w:val="0"/>
-          <w:numId w:val="3"/>
-        </w:numPr>
-        <w:spacing w:after="60"/>
-      </w:pPr>
-      <w:r>
-        <w:rPr>
-          <w:rFonts w:ascii="Calibri" w:cs="Calibri" w:eastAsia="Microsoft YaHei" w:hAnsi="Calibri"/>
-        </w:rPr>
-        <w:t xml:space="preserve">Lombardi R, Menchini L, Corneli T, et al. Wandering spleen in children: a report of 3 cases and a brief literature review underlining the importance of diagnostic imaging. Pediatr Radiol. 2014. doi:10.1007/s00247-013-2851-6</w:t>
-      </w:r>
-    </w:p>
-    <w:p>
-      <w:pPr>
-        <w:pStyle w:val="ListParagraph"/>
-        <w:numPr>
-          <w:ilvl w:val="0"/>
-          <w:numId w:val="3"/>
-        </w:numPr>
-        <w:spacing w:after="60"/>
-      </w:pPr>
-      <w:r>
-        <w:rPr>
-          <w:rFonts w:ascii="Calibri" w:cs="Calibri" w:eastAsia="Microsoft YaHei" w:hAnsi="Calibri"/>
-        </w:rPr>
-        <w:t xml:space="preserve">Alqadi GO, Saxena AK. Is laparoscopic approach for wandering spleen in children an option? J Minim Access Surg. 2019;15:93–7.</w:t>
-      </w:r>
-    </w:p>
-    <w:p>
-      <w:pPr>
-        <w:pStyle w:val="ListParagraph"/>
-        <w:numPr>
-          <w:ilvl w:val="0"/>
-          <w:numId w:val="3"/>
-        </w:numPr>
-        <w:spacing w:after="60"/>
-      </w:pPr>
-      <w:r>
-        <w:rPr>
-          <w:rFonts w:ascii="Calibri" w:cs="Calibri" w:eastAsia="Microsoft YaHei" w:hAnsi="Calibri"/>
-        </w:rPr>
-        <w:t xml:space="preserve">Barabino M, Luigiano C, Pellicano R, et al. "Wandering spleen" as a rare cause of recurrent abdominal pain: a systematic review. Minerva Chir. 2019;74:359–63.</w:t>
-      </w:r>
-    </w:p>
-    <w:p>
-      <w:pPr>
-        <w:pStyle w:val="ListParagraph"/>
-        <w:numPr>
-          <w:ilvl w:val="0"/>
-          <w:numId w:val="3"/>
-        </w:numPr>
-        <w:spacing w:after="60"/>
-      </w:pPr>
-      <w:r>
-        <w:rPr>
-          <w:rFonts w:ascii="Calibri" w:cs="Calibri" w:eastAsia="Microsoft YaHei" w:hAnsi="Calibri"/>
-        </w:rPr>
-        <w:t xml:space="preserve">Moore E, O'Brien JW, Merali N, et al. Gastric outlet obstruction secondary to a wandering spleen: systematic review and surgical management of a case. Ann R Coll Surg Engl. 2023;105:501–6.</w:t>
-      </w:r>
-    </w:p>
-    <w:p>
-      <w:pPr>
-        <w:pStyle w:val="ListParagraph"/>
-        <w:numPr>
-          <w:ilvl w:val="0"/>
-          <w:numId w:val="3"/>
-        </w:numPr>
-        <w:spacing w:after="60"/>
-      </w:pPr>
-      <w:r>
-        <w:rPr>
-          <w:rFonts w:ascii="Calibri" w:cs="Calibri" w:eastAsia="Microsoft YaHei" w:hAnsi="Calibri"/>
-        </w:rPr>
-        <w:t xml:space="preserve">Page MJ, McKenzie JE, Bossuyt PM, et al. The PRISMA 2020 statement: an updated guideline for reporting systematic reviews. BMJ. 2021;372:n71.</w:t>
-      </w:r>
-    </w:p>
-    <w:p>
-      <w:pPr>
-        <w:pStyle w:val="ListParagraph"/>
-        <w:numPr>
-          <w:ilvl w:val="0"/>
-          <w:numId w:val="3"/>
-        </w:numPr>
-        <w:spacing w:after="60"/>
-      </w:pPr>
-      <w:r>
-        <w:rPr>
-          <w:rFonts w:ascii="Calibri" w:cs="Calibri" w:eastAsia="Microsoft YaHei" w:hAnsi="Calibri"/>
-        </w:rPr>
-        <w:t xml:space="preserve">Stewart LA, Clarke M, Rovers M, et al. Preferred reporting items for a systematic review and meta-analysis of individual participant data: the PRISMA-IPD statement. JAMA. 2015;313:1657–65.</w:t>
-      </w:r>
-    </w:p>
-    <w:p>
-      <w:pPr>
-        <w:pStyle w:val="ListParagraph"/>
-        <w:numPr>
-          <w:ilvl w:val="0"/>
-          <w:numId w:val="3"/>
-        </w:numPr>
-        <w:spacing w:after="60"/>
-      </w:pPr>
-      <w:r>
-        <w:rPr>
-          <w:rFonts w:ascii="Calibri" w:cs="Calibri" w:eastAsia="Microsoft YaHei" w:hAnsi="Calibri"/>
-        </w:rPr>
-        <w:t xml:space="preserve">Rethlefsen ML, Kirtley S, Waffenschmidt S, et al. PRISMA-S: an extension to the PRISMA Statement for Reporting Literature Searches in Systematic Reviews. Syst Rev. 2021;10:39.</w:t>
-      </w:r>
-    </w:p>
-    <w:p>
-      <w:pPr>
-        <w:pStyle w:val="ListParagraph"/>
-        <w:numPr>
-          <w:ilvl w:val="0"/>
-          <w:numId w:val="3"/>
-        </w:numPr>
-        <w:spacing w:after="60"/>
-      </w:pPr>
-      <w:r>
-        <w:rPr>
-          <w:rFonts w:ascii="Calibri" w:cs="Calibri" w:eastAsia="Microsoft YaHei" w:hAnsi="Calibri"/>
-        </w:rPr>
-        <w:t xml:space="preserve">Murad MH, Sultan S, Haffar S, Bazerbachi F. Methodological quality and synthesis of case series and case reports. BMJ Evid Based Med. 2018;23:60–3.</w:t>
-      </w:r>
-    </w:p>
-    <w:p>
-      <w:pPr>
-        <w:pStyle w:val="Heading2"/>
-        <w:keepNext/>
-      </w:pPr>
-      <w:r>
-        <w:rPr>
-          <w:rFonts w:ascii="Calibri" w:cs="Calibri" w:eastAsia="Microsoft YaHei" w:hAnsi="Calibri"/>
-        </w:rPr>
-        <w:t xml:space="preserve">Supplementary files (planned)</w:t>
-      </w:r>
-    </w:p>
-    <w:p>
-      <w:pPr>
-        <w:pStyle w:val="ListParagraph"/>
-        <w:numPr>
-          <w:ilvl w:val="0"/>
-          <w:numId w:val="2"/>
-        </w:numPr>
-        <w:spacing w:after="60"/>
-      </w:pPr>
-      <w:r>
-        <w:rPr>
-          <w:rFonts w:ascii="Calibri" w:cs="Calibri" w:eastAsia="Microsoft YaHei" w:hAnsi="Calibri"/>
-        </w:rPr>
-        <w:t xml:space="preserve">Supplementary File 1: search strategies for each database and the search log (PRISMA-S).</w:t>
-      </w:r>
-    </w:p>
-    <w:p>
-      <w:pPr>
-        <w:pStyle w:val="ListParagraph"/>
-        <w:numPr>
-          <w:ilvl w:val="0"/>
-          <w:numId w:val="2"/>
-        </w:numPr>
-        <w:spacing w:after="60"/>
-      </w:pPr>
-      <w:r>
-        <w:rPr>
-          <w:rFonts w:ascii="Calibri" w:cs="Calibri" w:eastAsia="Microsoft YaHei" w:hAnsi="Calibri"/>
-        </w:rPr>
-        <w:t xml:space="preserve">Supplementary File 2: data-extraction form and coding rules, including the duration-conversion rules.</w:t>
-      </w:r>
-    </w:p>
-    <w:p>
-      <w:pPr>
-        <w:pStyle w:val="ListParagraph"/>
-        <w:numPr>
-          <w:ilvl w:val="0"/>
-          <w:numId w:val="2"/>
-        </w:numPr>
-        <w:spacing w:after="60"/>
-      </w:pPr>
-      <w:r>
-        <w:rPr>
-          <w:rFonts w:ascii="Calibri" w:cs="Calibri" w:eastAsia="Microsoft YaHei" w:hAnsi="Calibri"/>
-        </w:rPr>
-        <w:t xml:space="preserve">Supplementary File 3: the individual patient dataset.</w:t>
-      </w:r>
-    </w:p>
-    <w:p>
-      <w:pPr>
-        <w:pStyle w:val="ListParagraph"/>
-        <w:numPr>
-          <w:ilvl w:val="0"/>
-          <w:numId w:val="2"/>
-        </w:numPr>
-        <w:spacing w:after="60"/>
-      </w:pPr>
-      <w:r>
-        <w:rPr>
-          <w:rFonts w:ascii="Calibri" w:cs="Calibri" w:eastAsia="Microsoft YaHei" w:hAnsi="Calibri"/>
-        </w:rPr>
-        <w:t xml:space="preserve">Supplementary File 4: PRISMA 2020 and PRISMA-IPD checklists.</w:t>
+        </w:rPr>
+        <w:t xml:space="preserve">Additional file 4 (format to be decided): PRISMA 2020 and PRISMA-IPD checklists.</w:t>
       </w:r>
     </w:p>
     <w:sectPr>

</xml_diff>

<commit_message>
Manuscript draft: institutional series (Methods, Results, Table 4) written from the EJP case data
Co-Authored-By: Claude Sonnet 5.5 <noreply@anthropic.com>
Claude-Session: https://claude.ai/code/session_01FRD7etKqYN8v2bbXeeLMRW
</commit_message>
<xml_diff>
--- a/Manuscript draft - systematic review with IPD (v0.1).docx
+++ b/Manuscript draft - systematic review with IPD (v0.1).docx
@@ -1750,24 +1750,60 @@
       <w:r>
         <w:rPr>
           <w:rFonts w:ascii="Calibri" w:cs="Calibri" w:eastAsia="Microsoft YaHei" w:hAnsi="Calibri"/>
-          <w:b/>
-          <w:bCs/>
-        </w:rPr>
-        <w:t xml:space="preserve">[PENDING: authors to complete: the period covered, how the five children were identified, their treatment, and follow-up.]</w:t>
-      </w:r>
-      <w:r>
-        <w:rPr>
-          <w:rFonts w:ascii="Calibri" w:cs="Calibri" w:eastAsia="Microsoft YaHei" w:hAnsi="Calibri"/>
-        </w:rPr>
-        <w:t xml:space="preserve"> The study was approved by the ethics committee of Wuhan Children's Hospital (2025R156-E01), and the approval was supplemented to cover the fifth patient. </w:t>
-      </w:r>
-      <w:r>
-        <w:rPr>
-          <w:rFonts w:ascii="Calibri" w:cs="Calibri" w:eastAsia="Microsoft YaHei" w:hAnsi="Calibri"/>
-          <w:b/>
-          <w:bCs/>
-        </w:rPr>
-        <w:t xml:space="preserve">[PENDING: confirm written informed consent for publication of clinical details and images from the parents of all five children, and whether the supplementary approval carries its own number.]</w:t>
+        </w:rPr>
+        <w:t xml:space="preserve">We retrospectively reviewed the records of all children treated surgically for wandering spleen at Wuhan Children's Hospital between 1 May 2015 and 1 May 2026. The definition of wandering spleen was that of the review. Children in whom the diagnosis was made but who never underwent splenic surgery were not included, so the series describes only children who came to operation, and this differs from the review, in which children managed without operation were to be summarised descriptively. </w:t>
+      </w:r>
+      <w:r>
+        <w:rPr>
+          <w:rFonts w:ascii="Calibri" w:cs="Calibri" w:eastAsia="Microsoft YaHei" w:hAnsi="Calibri"/>
+          <w:b/>
+          <w:bCs/>
+        </w:rPr>
+        <w:t xml:space="preserve">[PENDING: how the children were identified in the hospital records (operation register, diagnosis codes or another method) and whether any child who met these criteria was left out.]</w:t>
+      </w:r>
+      <w:r>
+        <w:rPr>
+          <w:rFonts w:ascii="Calibri" w:cs="Calibri" w:eastAsia="Microsoft YaHei" w:hAnsi="Calibri"/>
+        </w:rPr>
+        <w:t xml:space="preserve"> Five children were identified.</w:t>
+      </w:r>
+    </w:p>
+    <w:p>
+      <w:pPr>
+        <w:spacing w:after="120"/>
+      </w:pPr>
+      <w:r>
+        <w:rPr>
+          <w:rFonts w:ascii="Calibri" w:cs="Calibri" w:eastAsia="Microsoft YaHei" w:hAnsi="Calibri"/>
+        </w:rPr>
+        <w:t xml:space="preserve">Demographic characteristics, presenting symptoms and their duration, physical findings, laboratory results (platelet count at every encounter), imaging findings, operative details and the postoperative course were taken from the medical records. Each hospital encounter was recorded separately, so that the interval between the first presentation and splenic surgery could be determined. Follow-up was by outpatient review and telephone interview, with abdominal ultrasonography or contrast-enhanced CT after operation to assess the position and perfusion of the spleen. For the pooled analysis the five children were coded with the same variables and conversion rules as the published cases (Additional file 2) and entered as one report. </w:t>
+      </w:r>
+      <w:r>
+        <w:rPr>
+          <w:rFonts w:ascii="Calibri" w:cs="Calibri" w:eastAsia="Microsoft YaHei" w:hAnsi="Calibri"/>
+          <w:b/>
+          <w:bCs/>
+        </w:rPr>
+        <w:t xml:space="preserve">[PENDING: who coded the children, whether a second author checked the coding against the records, and whether the five children are one cluster in the cluster-robust analysis (to be confirmed with the statistician).]</w:t>
+      </w:r>
+    </w:p>
+    <w:p>
+      <w:pPr>
+        <w:spacing w:after="120"/>
+      </w:pPr>
+      <w:r>
+        <w:rPr>
+          <w:rFonts w:ascii="Calibri" w:cs="Calibri" w:eastAsia="Microsoft YaHei" w:hAnsi="Calibri"/>
+        </w:rPr>
+        <w:t xml:space="preserve">The study was approved by the ethics committee of Wuhan Children's Hospital (2025R156-E01), and the approval was supplemented to cover the fifth patient. Because the data were collected retrospectively and no identifiable information is reported, the committee waived the requirement for individual informed consent to the review of the records. </w:t>
+      </w:r>
+      <w:r>
+        <w:rPr>
+          <w:rFonts w:ascii="Calibri" w:cs="Calibri" w:eastAsia="Microsoft YaHei" w:hAnsi="Calibri"/>
+          <w:b/>
+          <w:bCs/>
+        </w:rPr>
+        <w:t xml:space="preserve">[PENDING: confirm written consent for publication of clinical details and images from the parents of all five children, and whether the supplementary approval carries its own number.]</w:t>
       </w:r>
     </w:p>
     <w:p>
@@ -1981,10 +2017,1715 @@
       <w:r>
         <w:rPr>
           <w:rFonts w:ascii="Calibri" w:cs="Calibri" w:eastAsia="Microsoft YaHei" w:hAnsi="Calibri"/>
-          <w:b/>
-          <w:bCs/>
-        </w:rPr>
-        <w:t xml:space="preserve">[PENDING.]</w:t>
+        </w:rPr>
+        <w:t xml:space="preserve">Five children, two girls and three boys, were operated on for wandering spleen during the study period. They were aged 2.75 to 13.08 years at their first presentation and together accounted for ten hospital encounters. Abdominal pain, alone or with vomiting or distension, was the presenting complaint at every encounter, and ultrasonography or CT established the diagnosis before operation in all five. Table 4 shows the course of each child and how the children were coded for the pooled analysis.</w:t>
+      </w:r>
+    </w:p>
+    <w:p>
+      <w:pPr>
+        <w:spacing w:after="120"/>
+      </w:pPr>
+      <w:r>
+        <w:rPr>
+          <w:rFonts w:ascii="Calibri" w:cs="Calibri" w:eastAsia="Microsoft YaHei" w:hAnsi="Calibri"/>
+          <w:b/>
+          <w:bCs/>
+        </w:rPr>
+        <w:t xml:space="preserve">Course before the index operation.</w:t>
+      </w:r>
+      <w:r>
+        <w:rPr>
+          <w:rFonts w:ascii="Calibri" w:cs="Calibri" w:eastAsia="Microsoft YaHei" w:hAnsi="Calibri"/>
+        </w:rPr>
+        <w:t xml:space="preserve"> In Cases 1, 2 and 3 the diagnosis was made at the first presentation and operation was advised, but the families declined and chose conservative management with fluid resuscitation, gastrointestinal decompression and postural measures. Symptoms settled each time, after 5 to 7 days, and the children were discharged. All three were readmitted with recurrent pain and had their first splenic operation 16, 19 and 62 months after the first presentation (mean 32 months); Case 3 attended four times over more than five years. Case 5 had been admitted to another hospital one week before presentation and treated there as acute gastritis. Case 4 was operated on at his first presentation, because of a coexisting gastric perforation.</w:t>
+      </w:r>
+    </w:p>
+    <w:p>
+      <w:pPr>
+        <w:spacing w:after="120"/>
+      </w:pPr>
+      <w:r>
+        <w:rPr>
+          <w:rFonts w:ascii="Calibri" w:cs="Calibri" w:eastAsia="Microsoft YaHei" w:hAnsi="Calibri"/>
+          <w:b/>
+          <w:bCs/>
+        </w:rPr>
+        <w:t xml:space="preserve">Index episode and spleen at operation.</w:t>
+      </w:r>
+      <w:r>
+        <w:rPr>
+          <w:rFonts w:ascii="Calibri" w:cs="Calibri" w:eastAsia="Microsoft YaHei" w:hAnsi="Calibri"/>
+        </w:rPr>
+        <w:t xml:space="preserve"> At the index operation the index episode had lasted 1 day in Case 1, 1 day in Case 2, 9 days in Case 3, 2 hours in Case 4 and about 21 hours in Case 5 (18 hours of continuous periumbilical pain before presentation and 2.5 hours from presentation to operation). For Cases 1, 2 and 4 the time from presentation to operation was not available when the children were coded, so none was added (rule 9) and these durations may be underestimates. </w:t>
+      </w:r>
+      <w:r>
+        <w:rPr>
+          <w:rFonts w:ascii="Calibri" w:cs="Calibri" w:eastAsia="Microsoft YaHei" w:hAnsi="Calibri"/>
+          <w:b/>
+          <w:bCs/>
+        </w:rPr>
+        <w:t xml:space="preserve">[PENDING: take the exact times of onset and operation from the records; where both are known the interval is calculated exactly (rule 8).]</w:t>
+      </w:r>
+      <w:r>
+        <w:rPr>
+          <w:rFonts w:ascii="Calibri" w:cs="Calibri" w:eastAsia="Microsoft YaHei" w:hAnsi="Calibri"/>
+        </w:rPr>
+        <w:t xml:space="preserve"> The spleen was non-viable at the index operation in four children. Cases 1 and 2 had pedicle torsion with infarction on CT and underwent total splenectomy, by laparotomy and by laparoscopy converted to laparotomy respectively; their preoperative platelet counts were 428 and 525 × 10⁹/L. In Case 5 the pedicle was twisted through about 720° and the spleen was congested, dark purple and did not reperfuse after detorsion; the platelet count was normal, the white cell count 24.20 × 10⁹/L and the C-reactive protein 117 mg/L. Non-contrast CT had shown an enlarged, heterogeneous spleen in the anterior lower abdomen and pelvis, a whirl sign formed by the spiralling splenic vessels, perisplenic fat stranding, splenic vessels encircling the splenic flexure of the colon, and free fluid. Total splenectomy with separate double ligation of the splenic artery took 81 minutes, with a blood loss of 10 mL.</w:t>
+      </w:r>
+    </w:p>
+    <w:p>
+      <w:pPr>
+        <w:spacing w:after="120"/>
+      </w:pPr>
+      <w:r>
+        <w:rPr>
+          <w:rFonts w:ascii="Calibri" w:cs="Calibri" w:eastAsia="Microsoft YaHei" w:hAnsi="Calibri"/>
+          <w:b/>
+          <w:bCs/>
+        </w:rPr>
+        <w:t xml:space="preserve">Case 3.</w:t>
+      </w:r>
+      <w:r>
+        <w:rPr>
+          <w:rFonts w:ascii="Calibri" w:cs="Calibri" w:eastAsia="Microsoft YaHei" w:hAnsi="Calibri"/>
+        </w:rPr>
+        <w:t xml:space="preserve"> At her third attendance CT showed a wandering spleen measuring 17.3 × 7.6 cm with partial infarction. At laparoscopy the infarcted parenchyma was resected and a subperitoneal pouch was made, but the spleen was too large to fit in it. The upper pole was therefore sutured to the diaphragm and the lower pole to the lateral peritoneum with 5-0 silk, with Hem-o-lok clips added. CT one week later showed a normally sited spleen. One month later she was readmitted with abdominal pain, and CT showed recurrent migration of the spleen (16.6 × 7.6 cm) with anteromedial rotation of the body and tail of the pancreas. Total splenectomy followed, and the resected spleen was cut into 3-cm slices and implanted in the greater omentum. Under the protocol's primary definition the spleen was non-viable at the index operation, because a partial splenectomy was done for infarction; in the sensitivity analysis that codes partial splenectomy for partial infarction as salvage it counts as viable, and the later total splenectomy is then reported as failure after splenopexy. </w:t>
+      </w:r>
+      <w:r>
+        <w:rPr>
+          <w:rFonts w:ascii="Calibri" w:cs="Calibri" w:eastAsia="Microsoft YaHei" w:hAnsi="Calibri"/>
+          <w:b/>
+          <w:bCs/>
+        </w:rPr>
+        <w:t xml:space="preserve">[PENDING: the authors to confirm this coding, to state whether the spleen removed at the second operation was viable, and to check the duration against the chart: the nine days were intermittent pain, and the duration of any worsening is needed for the alternative coding in rule 6.]</w:t>
+      </w:r>
+    </w:p>
+    <w:p>
+      <w:pPr>
+        <w:spacing w:after="120"/>
+      </w:pPr>
+      <w:r>
+        <w:rPr>
+          <w:rFonts w:ascii="Calibri" w:cs="Calibri" w:eastAsia="Microsoft YaHei" w:hAnsi="Calibri"/>
+          <w:b/>
+          <w:bCs/>
+        </w:rPr>
+        <w:t xml:space="preserve">Case 4 and the reinforced two-pole fixation.</w:t>
+      </w:r>
+      <w:r>
+        <w:rPr>
+          <w:rFonts w:ascii="Calibri" w:cs="Calibri" w:eastAsia="Microsoft YaHei" w:hAnsi="Calibri"/>
+        </w:rPr>
+        <w:t xml:space="preserve"> Case 4 presented with two hours of abdominal distension. Non-contrast CT showed marked gastric distension with a wandering spleen and pedicle torsion, and contrast-enhanced CT 1.5 hours later showed free intraperitoneal and pelvic fluid, gastric volvulus and a gastrointestinal perforation; the spleen measured 8.4 × 3.7 cm and enhanced uniformly. At emergency laparotomy the stomach had rotated about its mesenteric axis; after reduction a 2-cm perforation on the posterior wall of the antrum was repaired. The spleen lay in the left mid-abdomen, held only by its pedicle, and was viable. It was returned to the left upper quadrant and fixed at both poles (Figure 2). Absorbable haemostatic gauze was laid on the visceral and diaphragmatic surfaces of the upper pole. A 2-0 non-absorbable silk suture was passed through the gauze on the visceral surface and the full thickness of the splenic parenchyma, out through the gauze on the diaphragmatic surface, through the diaphragmatic muscle, back through the gauze and the full thickness of the parenchyma, and tied on the visceral surface. The lower pole was fixed to the left lateral abdominal wall in the same way. He recovered without incident, and CT at 13 months showed a normally positioned spleen; he had no symptoms. </w:t>
+      </w:r>
+      <w:r>
+        <w:rPr>
+          <w:rFonts w:ascii="Calibri" w:cs="Calibri" w:eastAsia="Microsoft YaHei" w:hAnsi="Calibri"/>
+          <w:b/>
+          <w:bCs/>
+        </w:rPr>
+        <w:t xml:space="preserve">[PENDING: Figure 2, the schematic of the technique, at the journal's resolution; follow-up of Cases 4 and 5 to be updated at submission.]</w:t>
+      </w:r>
+    </w:p>
+    <w:p>
+      <w:pPr>
+        <w:spacing w:after="120"/>
+      </w:pPr>
+      <w:r>
+        <w:rPr>
+          <w:rFonts w:ascii="Calibri" w:cs="Calibri" w:eastAsia="Microsoft YaHei" w:hAnsi="Calibri"/>
+          <w:b/>
+          <w:bCs/>
+        </w:rPr>
+        <w:t xml:space="preserve">After operation.</w:t>
+      </w:r>
+      <w:r>
+        <w:rPr>
+          <w:rFonts w:ascii="Calibri" w:cs="Calibri" w:eastAsia="Microsoft YaHei" w:hAnsi="Calibri"/>
+        </w:rPr>
+        <w:t xml:space="preserve"> All four children who had a total splenectomy developed thrombocytosis, which reached 918 × 10⁹/L on the ninth postoperative day in Case 5, and the count returned to normal on oral dipyridamole in every case. None had overwhelming post-splenectomy infection, thromboembolism or pulmonary hypertension during follow-up. Case 5 was well 5 months after operation. </w:t>
+      </w:r>
+      <w:r>
+        <w:rPr>
+          <w:rFonts w:ascii="Calibri" w:cs="Calibri" w:eastAsia="Microsoft YaHei" w:hAnsi="Calibri"/>
+          <w:b/>
+          <w:bCs/>
+        </w:rPr>
+        <w:t xml:space="preserve">[PENDING: length of follow-up of Cases 1, 2 and 3, and whether vaccination and antibiotic prophylaxis after splenectomy are documented.]</w:t>
+      </w:r>
+    </w:p>
+    <w:p>
+      <w:pPr>
+        <w:spacing w:after="120"/>
+      </w:pPr>
+      <w:r>
+        <w:rPr>
+          <w:rFonts w:ascii="Calibri" w:cs="Calibri" w:eastAsia="Microsoft YaHei" w:hAnsi="Calibri"/>
+          <w:b/>
+          <w:bCs/>
+        </w:rPr>
+        <w:t xml:space="preserve">Table 4. Five children operated on at our institution, coded for the pooled analysis.</w:t>
+      </w:r>
+    </w:p>
+    <w:tbl>
+      <w:tblPr>
+        <w:tblW w:type="dxa" w:w="9026"/>
+        <w:tblBorders>
+          <w:top w:val="single" w:color="auto" w:sz="4"/>
+          <w:left w:val="single" w:color="auto" w:sz="4"/>
+          <w:bottom w:val="single" w:color="auto" w:sz="4"/>
+          <w:right w:val="single" w:color="auto" w:sz="4"/>
+          <w:insideH w:val="single" w:color="auto" w:sz="4"/>
+          <w:insideV w:val="single" w:color="auto" w:sz="4"/>
+        </w:tblBorders>
+      </w:tblPr>
+      <w:tblGrid>
+        <w:gridCol w:w="1002"/>
+        <w:gridCol w:w="1002"/>
+        <w:gridCol w:w="1002"/>
+        <w:gridCol w:w="1002"/>
+        <w:gridCol w:w="1002"/>
+        <w:gridCol w:w="1002"/>
+        <w:gridCol w:w="1002"/>
+        <w:gridCol w:w="1002"/>
+        <w:gridCol w:w="1010"/>
+      </w:tblGrid>
+      <w:tr>
+        <w:trPr>
+          <w:cantSplit/>
+          <w:tblHeader/>
+        </w:trPr>
+        <w:tc>
+          <w:tcPr>
+            <w:tcW w:type="dxa" w:w="1002"/>
+            <w:tcBorders>
+              <w:top w:val="single" w:color="BBBBBB" w:sz="4"/>
+              <w:left w:val="single" w:color="BBBBBB" w:sz="4"/>
+              <w:bottom w:val="single" w:color="BBBBBB" w:sz="4"/>
+              <w:right w:val="single" w:color="BBBBBB" w:sz="4"/>
+            </w:tcBorders>
+            <w:shd w:fill="E8EEF4" w:val="clear"/>
+            <w:tcMar>
+              <w:top w:type="dxa" w:w="60"/>
+              <w:left w:type="dxa" w:w="100"/>
+              <w:bottom w:type="dxa" w:w="60"/>
+              <w:right w:type="dxa" w:w="100"/>
+            </w:tcMar>
+          </w:tcPr>
+          <w:p>
+            <w:r>
+              <w:rPr>
+                <w:rFonts w:ascii="Calibri" w:cs="Calibri" w:eastAsia="Microsoft YaHei" w:hAnsi="Calibri"/>
+                <w:b/>
+                <w:bCs/>
+                <w:sz w:val="20"/>
+                <w:szCs w:val="20"/>
+              </w:rPr>
+              <w:t xml:space="preserve">Case</w:t>
+            </w:r>
+          </w:p>
+        </w:tc>
+        <w:tc>
+          <w:tcPr>
+            <w:tcW w:type="dxa" w:w="1002"/>
+            <w:tcBorders>
+              <w:top w:val="single" w:color="BBBBBB" w:sz="4"/>
+              <w:left w:val="single" w:color="BBBBBB" w:sz="4"/>
+              <w:bottom w:val="single" w:color="BBBBBB" w:sz="4"/>
+              <w:right w:val="single" w:color="BBBBBB" w:sz="4"/>
+            </w:tcBorders>
+            <w:shd w:fill="E8EEF4" w:val="clear"/>
+            <w:tcMar>
+              <w:top w:type="dxa" w:w="60"/>
+              <w:left w:type="dxa" w:w="100"/>
+              <w:bottom w:type="dxa" w:w="60"/>
+              <w:right w:type="dxa" w:w="100"/>
+            </w:tcMar>
+          </w:tcPr>
+          <w:p>
+            <w:r>
+              <w:rPr>
+                <w:rFonts w:ascii="Calibri" w:cs="Calibri" w:eastAsia="Microsoft YaHei" w:hAnsi="Calibri"/>
+                <w:b/>
+                <w:bCs/>
+                <w:sz w:val="20"/>
+                <w:szCs w:val="20"/>
+              </w:rPr>
+              <w:t xml:space="preserve">Sex</w:t>
+            </w:r>
+          </w:p>
+        </w:tc>
+        <w:tc>
+          <w:tcPr>
+            <w:tcW w:type="dxa" w:w="1002"/>
+            <w:tcBorders>
+              <w:top w:val="single" w:color="BBBBBB" w:sz="4"/>
+              <w:left w:val="single" w:color="BBBBBB" w:sz="4"/>
+              <w:bottom w:val="single" w:color="BBBBBB" w:sz="4"/>
+              <w:right w:val="single" w:color="BBBBBB" w:sz="4"/>
+            </w:tcBorders>
+            <w:shd w:fill="E8EEF4" w:val="clear"/>
+            <w:tcMar>
+              <w:top w:type="dxa" w:w="60"/>
+              <w:left w:type="dxa" w:w="100"/>
+              <w:bottom w:type="dxa" w:w="60"/>
+              <w:right w:type="dxa" w:w="100"/>
+            </w:tcMar>
+          </w:tcPr>
+          <w:p>
+            <w:r>
+              <w:rPr>
+                <w:rFonts w:ascii="Calibri" w:cs="Calibri" w:eastAsia="Microsoft YaHei" w:hAnsi="Calibri"/>
+                <w:b/>
+                <w:bCs/>
+                <w:sz w:val="20"/>
+                <w:szCs w:val="20"/>
+              </w:rPr>
+              <w:t xml:space="preserve">Age at index operation (years)</w:t>
+            </w:r>
+          </w:p>
+        </w:tc>
+        <w:tc>
+          <w:tcPr>
+            <w:tcW w:type="dxa" w:w="1002"/>
+            <w:tcBorders>
+              <w:top w:val="single" w:color="BBBBBB" w:sz="4"/>
+              <w:left w:val="single" w:color="BBBBBB" w:sz="4"/>
+              <w:bottom w:val="single" w:color="BBBBBB" w:sz="4"/>
+              <w:right w:val="single" w:color="BBBBBB" w:sz="4"/>
+            </w:tcBorders>
+            <w:shd w:fill="E8EEF4" w:val="clear"/>
+            <w:tcMar>
+              <w:top w:type="dxa" w:w="60"/>
+              <w:left w:type="dxa" w:w="100"/>
+              <w:bottom w:type="dxa" w:w="60"/>
+              <w:right w:type="dxa" w:w="100"/>
+            </w:tcMar>
+          </w:tcPr>
+          <w:p>
+            <w:r>
+              <w:rPr>
+                <w:rFonts w:ascii="Calibri" w:cs="Calibri" w:eastAsia="Microsoft YaHei" w:hAnsi="Calibri"/>
+                <w:b/>
+                <w:bCs/>
+                <w:sz w:val="20"/>
+                <w:szCs w:val="20"/>
+              </w:rPr>
+              <w:t xml:space="preserve">Index episode (days)</w:t>
+            </w:r>
+          </w:p>
+        </w:tc>
+        <w:tc>
+          <w:tcPr>
+            <w:tcW w:type="dxa" w:w="1002"/>
+            <w:tcBorders>
+              <w:top w:val="single" w:color="BBBBBB" w:sz="4"/>
+              <w:left w:val="single" w:color="BBBBBB" w:sz="4"/>
+              <w:bottom w:val="single" w:color="BBBBBB" w:sz="4"/>
+              <w:right w:val="single" w:color="BBBBBB" w:sz="4"/>
+            </w:tcBorders>
+            <w:shd w:fill="E8EEF4" w:val="clear"/>
+            <w:tcMar>
+              <w:top w:type="dxa" w:w="60"/>
+              <w:left w:type="dxa" w:w="100"/>
+              <w:bottom w:type="dxa" w:w="60"/>
+              <w:right w:type="dxa" w:w="100"/>
+            </w:tcMar>
+          </w:tcPr>
+          <w:p>
+            <w:r>
+              <w:rPr>
+                <w:rFonts w:ascii="Calibri" w:cs="Calibri" w:eastAsia="Microsoft YaHei" w:hAnsi="Calibri"/>
+                <w:b/>
+                <w:bCs/>
+                <w:sz w:val="20"/>
+                <w:szCs w:val="20"/>
+              </w:rPr>
+              <w:t xml:space="preserve">Diagnosis before the index episode</w:t>
+            </w:r>
+          </w:p>
+        </w:tc>
+        <w:tc>
+          <w:tcPr>
+            <w:tcW w:type="dxa" w:w="1002"/>
+            <w:tcBorders>
+              <w:top w:val="single" w:color="BBBBBB" w:sz="4"/>
+              <w:left w:val="single" w:color="BBBBBB" w:sz="4"/>
+              <w:bottom w:val="single" w:color="BBBBBB" w:sz="4"/>
+              <w:right w:val="single" w:color="BBBBBB" w:sz="4"/>
+            </w:tcBorders>
+            <w:shd w:fill="E8EEF4" w:val="clear"/>
+            <w:tcMar>
+              <w:top w:type="dxa" w:w="60"/>
+              <w:left w:type="dxa" w:w="100"/>
+              <w:bottom w:type="dxa" w:w="60"/>
+              <w:right w:type="dxa" w:w="100"/>
+            </w:tcMar>
+          </w:tcPr>
+          <w:p>
+            <w:r>
+              <w:rPr>
+                <w:rFonts w:ascii="Calibri" w:cs="Calibri" w:eastAsia="Microsoft YaHei" w:hAnsi="Calibri"/>
+                <w:b/>
+                <w:bCs/>
+                <w:sz w:val="20"/>
+                <w:szCs w:val="20"/>
+              </w:rPr>
+              <w:t xml:space="preserve">Preoperative platelet count (×10⁹/L)</w:t>
+            </w:r>
+          </w:p>
+        </w:tc>
+        <w:tc>
+          <w:tcPr>
+            <w:tcW w:type="dxa" w:w="1002"/>
+            <w:tcBorders>
+              <w:top w:val="single" w:color="BBBBBB" w:sz="4"/>
+              <w:left w:val="single" w:color="BBBBBB" w:sz="4"/>
+              <w:bottom w:val="single" w:color="BBBBBB" w:sz="4"/>
+              <w:right w:val="single" w:color="BBBBBB" w:sz="4"/>
+            </w:tcBorders>
+            <w:shd w:fill="E8EEF4" w:val="clear"/>
+            <w:tcMar>
+              <w:top w:type="dxa" w:w="60"/>
+              <w:left w:type="dxa" w:w="100"/>
+              <w:bottom w:type="dxa" w:w="60"/>
+              <w:right w:type="dxa" w:w="100"/>
+            </w:tcMar>
+          </w:tcPr>
+          <w:p>
+            <w:r>
+              <w:rPr>
+                <w:rFonts w:ascii="Calibri" w:cs="Calibri" w:eastAsia="Microsoft YaHei" w:hAnsi="Calibri"/>
+                <w:b/>
+                <w:bCs/>
+                <w:sz w:val="20"/>
+                <w:szCs w:val="20"/>
+              </w:rPr>
+              <w:t xml:space="preserve">Index operation</w:t>
+            </w:r>
+          </w:p>
+        </w:tc>
+        <w:tc>
+          <w:tcPr>
+            <w:tcW w:type="dxa" w:w="1002"/>
+            <w:tcBorders>
+              <w:top w:val="single" w:color="BBBBBB" w:sz="4"/>
+              <w:left w:val="single" w:color="BBBBBB" w:sz="4"/>
+              <w:bottom w:val="single" w:color="BBBBBB" w:sz="4"/>
+              <w:right w:val="single" w:color="BBBBBB" w:sz="4"/>
+            </w:tcBorders>
+            <w:shd w:fill="E8EEF4" w:val="clear"/>
+            <w:tcMar>
+              <w:top w:type="dxa" w:w="60"/>
+              <w:left w:type="dxa" w:w="100"/>
+              <w:bottom w:type="dxa" w:w="60"/>
+              <w:right w:type="dxa" w:w="100"/>
+            </w:tcMar>
+          </w:tcPr>
+          <w:p>
+            <w:r>
+              <w:rPr>
+                <w:rFonts w:ascii="Calibri" w:cs="Calibri" w:eastAsia="Microsoft YaHei" w:hAnsi="Calibri"/>
+                <w:b/>
+                <w:bCs/>
+                <w:sz w:val="20"/>
+                <w:szCs w:val="20"/>
+              </w:rPr>
+              <w:t xml:space="preserve">Spleen at index operation</w:t>
+            </w:r>
+          </w:p>
+        </w:tc>
+        <w:tc>
+          <w:tcPr>
+            <w:tcW w:type="dxa" w:w="1010"/>
+            <w:tcBorders>
+              <w:top w:val="single" w:color="BBBBBB" w:sz="4"/>
+              <w:left w:val="single" w:color="BBBBBB" w:sz="4"/>
+              <w:bottom w:val="single" w:color="BBBBBB" w:sz="4"/>
+              <w:right w:val="single" w:color="BBBBBB" w:sz="4"/>
+            </w:tcBorders>
+            <w:shd w:fill="E8EEF4" w:val="clear"/>
+            <w:tcMar>
+              <w:top w:type="dxa" w:w="60"/>
+              <w:left w:type="dxa" w:w="100"/>
+              <w:bottom w:type="dxa" w:w="60"/>
+              <w:right w:type="dxa" w:w="100"/>
+            </w:tcMar>
+          </w:tcPr>
+          <w:p>
+            <w:r>
+              <w:rPr>
+                <w:rFonts w:ascii="Calibri" w:cs="Calibri" w:eastAsia="Microsoft YaHei" w:hAnsi="Calibri"/>
+                <w:b/>
+                <w:bCs/>
+                <w:sz w:val="20"/>
+                <w:szCs w:val="20"/>
+              </w:rPr>
+              <w:t xml:space="preserve">Final splenic status</w:t>
+            </w:r>
+          </w:p>
+        </w:tc>
+      </w:tr>
+      <w:tr>
+        <w:trPr>
+          <w:cantSplit/>
+          <w:tblHeader w:val="false"/>
+        </w:trPr>
+        <w:tc>
+          <w:tcPr>
+            <w:tcW w:type="dxa" w:w="1002"/>
+            <w:tcBorders>
+              <w:top w:val="single" w:color="BBBBBB" w:sz="4"/>
+              <w:left w:val="single" w:color="BBBBBB" w:sz="4"/>
+              <w:bottom w:val="single" w:color="BBBBBB" w:sz="4"/>
+              <w:right w:val="single" w:color="BBBBBB" w:sz="4"/>
+            </w:tcBorders>
+            <w:tcMar>
+              <w:top w:type="dxa" w:w="60"/>
+              <w:left w:type="dxa" w:w="100"/>
+              <w:bottom w:type="dxa" w:w="60"/>
+              <w:right w:type="dxa" w:w="100"/>
+            </w:tcMar>
+          </w:tcPr>
+          <w:p>
+            <w:r>
+              <w:rPr>
+                <w:rFonts w:ascii="Calibri" w:cs="Calibri" w:eastAsia="Microsoft YaHei" w:hAnsi="Calibri"/>
+                <w:sz w:val="20"/>
+                <w:szCs w:val="20"/>
+              </w:rPr>
+              <w:t xml:space="preserve">1</w:t>
+            </w:r>
+          </w:p>
+        </w:tc>
+        <w:tc>
+          <w:tcPr>
+            <w:tcW w:type="dxa" w:w="1002"/>
+            <w:tcBorders>
+              <w:top w:val="single" w:color="BBBBBB" w:sz="4"/>
+              <w:left w:val="single" w:color="BBBBBB" w:sz="4"/>
+              <w:bottom w:val="single" w:color="BBBBBB" w:sz="4"/>
+              <w:right w:val="single" w:color="BBBBBB" w:sz="4"/>
+            </w:tcBorders>
+            <w:tcMar>
+              <w:top w:type="dxa" w:w="60"/>
+              <w:left w:type="dxa" w:w="100"/>
+              <w:bottom w:type="dxa" w:w="60"/>
+              <w:right w:type="dxa" w:w="100"/>
+            </w:tcMar>
+          </w:tcPr>
+          <w:p>
+            <w:r>
+              <w:rPr>
+                <w:rFonts w:ascii="Calibri" w:cs="Calibri" w:eastAsia="Microsoft YaHei" w:hAnsi="Calibri"/>
+                <w:sz w:val="20"/>
+                <w:szCs w:val="20"/>
+              </w:rPr>
+              <w:t xml:space="preserve">M</w:t>
+            </w:r>
+          </w:p>
+        </w:tc>
+        <w:tc>
+          <w:tcPr>
+            <w:tcW w:type="dxa" w:w="1002"/>
+            <w:tcBorders>
+              <w:top w:val="single" w:color="BBBBBB" w:sz="4"/>
+              <w:left w:val="single" w:color="BBBBBB" w:sz="4"/>
+              <w:bottom w:val="single" w:color="BBBBBB" w:sz="4"/>
+              <w:right w:val="single" w:color="BBBBBB" w:sz="4"/>
+            </w:tcBorders>
+            <w:tcMar>
+              <w:top w:type="dxa" w:w="60"/>
+              <w:left w:type="dxa" w:w="100"/>
+              <w:bottom w:type="dxa" w:w="60"/>
+              <w:right w:type="dxa" w:w="100"/>
+            </w:tcMar>
+          </w:tcPr>
+          <w:p>
+            <w:r>
+              <w:rPr>
+                <w:rFonts w:ascii="Calibri" w:cs="Calibri" w:eastAsia="Microsoft YaHei" w:hAnsi="Calibri"/>
+                <w:sz w:val="20"/>
+                <w:szCs w:val="20"/>
+              </w:rPr>
+              <w:t xml:space="preserve">5.08</w:t>
+            </w:r>
+          </w:p>
+        </w:tc>
+        <w:tc>
+          <w:tcPr>
+            <w:tcW w:type="dxa" w:w="1002"/>
+            <w:tcBorders>
+              <w:top w:val="single" w:color="BBBBBB" w:sz="4"/>
+              <w:left w:val="single" w:color="BBBBBB" w:sz="4"/>
+              <w:bottom w:val="single" w:color="BBBBBB" w:sz="4"/>
+              <w:right w:val="single" w:color="BBBBBB" w:sz="4"/>
+            </w:tcBorders>
+            <w:tcMar>
+              <w:top w:type="dxa" w:w="60"/>
+              <w:left w:type="dxa" w:w="100"/>
+              <w:bottom w:type="dxa" w:w="60"/>
+              <w:right w:type="dxa" w:w="100"/>
+            </w:tcMar>
+          </w:tcPr>
+          <w:p>
+            <w:r>
+              <w:rPr>
+                <w:rFonts w:ascii="Calibri" w:cs="Calibri" w:eastAsia="Microsoft YaHei" w:hAnsi="Calibri"/>
+                <w:sz w:val="20"/>
+                <w:szCs w:val="20"/>
+              </w:rPr>
+              <w:t xml:space="preserve">1 ᵃ</w:t>
+            </w:r>
+          </w:p>
+        </w:tc>
+        <w:tc>
+          <w:tcPr>
+            <w:tcW w:type="dxa" w:w="1002"/>
+            <w:tcBorders>
+              <w:top w:val="single" w:color="BBBBBB" w:sz="4"/>
+              <w:left w:val="single" w:color="BBBBBB" w:sz="4"/>
+              <w:bottom w:val="single" w:color="BBBBBB" w:sz="4"/>
+              <w:right w:val="single" w:color="BBBBBB" w:sz="4"/>
+            </w:tcBorders>
+            <w:tcMar>
+              <w:top w:type="dxa" w:w="60"/>
+              <w:left w:type="dxa" w:w="100"/>
+              <w:bottom w:type="dxa" w:w="60"/>
+              <w:right w:type="dxa" w:w="100"/>
+            </w:tcMar>
+          </w:tcPr>
+          <w:p>
+            <w:r>
+              <w:rPr>
+                <w:rFonts w:ascii="Calibri" w:cs="Calibri" w:eastAsia="Microsoft YaHei" w:hAnsi="Calibri"/>
+                <w:sz w:val="20"/>
+                <w:szCs w:val="20"/>
+              </w:rPr>
+              <w:t xml:space="preserve">Known; operation declined, readmitted after 16 months</w:t>
+            </w:r>
+          </w:p>
+        </w:tc>
+        <w:tc>
+          <w:tcPr>
+            <w:tcW w:type="dxa" w:w="1002"/>
+            <w:tcBorders>
+              <w:top w:val="single" w:color="BBBBBB" w:sz="4"/>
+              <w:left w:val="single" w:color="BBBBBB" w:sz="4"/>
+              <w:bottom w:val="single" w:color="BBBBBB" w:sz="4"/>
+              <w:right w:val="single" w:color="BBBBBB" w:sz="4"/>
+            </w:tcBorders>
+            <w:tcMar>
+              <w:top w:type="dxa" w:w="60"/>
+              <w:left w:type="dxa" w:w="100"/>
+              <w:bottom w:type="dxa" w:w="60"/>
+              <w:right w:type="dxa" w:w="100"/>
+            </w:tcMar>
+          </w:tcPr>
+          <w:p>
+            <w:r>
+              <w:rPr>
+                <w:rFonts w:ascii="Calibri" w:cs="Calibri" w:eastAsia="Microsoft YaHei" w:hAnsi="Calibri"/>
+                <w:sz w:val="20"/>
+                <w:szCs w:val="20"/>
+              </w:rPr>
+              <w:t xml:space="preserve">428</w:t>
+            </w:r>
+          </w:p>
+        </w:tc>
+        <w:tc>
+          <w:tcPr>
+            <w:tcW w:type="dxa" w:w="1002"/>
+            <w:tcBorders>
+              <w:top w:val="single" w:color="BBBBBB" w:sz="4"/>
+              <w:left w:val="single" w:color="BBBBBB" w:sz="4"/>
+              <w:bottom w:val="single" w:color="BBBBBB" w:sz="4"/>
+              <w:right w:val="single" w:color="BBBBBB" w:sz="4"/>
+            </w:tcBorders>
+            <w:tcMar>
+              <w:top w:type="dxa" w:w="60"/>
+              <w:left w:type="dxa" w:w="100"/>
+              <w:bottom w:type="dxa" w:w="60"/>
+              <w:right w:type="dxa" w:w="100"/>
+            </w:tcMar>
+          </w:tcPr>
+          <w:p>
+            <w:r>
+              <w:rPr>
+                <w:rFonts w:ascii="Calibri" w:cs="Calibri" w:eastAsia="Microsoft YaHei" w:hAnsi="Calibri"/>
+                <w:sz w:val="20"/>
+                <w:szCs w:val="20"/>
+              </w:rPr>
+              <w:t xml:space="preserve">Total splenectomy (laparotomy)</w:t>
+            </w:r>
+          </w:p>
+        </w:tc>
+        <w:tc>
+          <w:tcPr>
+            <w:tcW w:type="dxa" w:w="1002"/>
+            <w:tcBorders>
+              <w:top w:val="single" w:color="BBBBBB" w:sz="4"/>
+              <w:left w:val="single" w:color="BBBBBB" w:sz="4"/>
+              <w:bottom w:val="single" w:color="BBBBBB" w:sz="4"/>
+              <w:right w:val="single" w:color="BBBBBB" w:sz="4"/>
+            </w:tcBorders>
+            <w:tcMar>
+              <w:top w:type="dxa" w:w="60"/>
+              <w:left w:type="dxa" w:w="100"/>
+              <w:bottom w:type="dxa" w:w="60"/>
+              <w:right w:type="dxa" w:w="100"/>
+            </w:tcMar>
+          </w:tcPr>
+          <w:p>
+            <w:r>
+              <w:rPr>
+                <w:rFonts w:ascii="Calibri" w:cs="Calibri" w:eastAsia="Microsoft YaHei" w:hAnsi="Calibri"/>
+                <w:sz w:val="20"/>
+                <w:szCs w:val="20"/>
+              </w:rPr>
+              <w:t xml:space="preserve">Non-viable</w:t>
+            </w:r>
+          </w:p>
+        </w:tc>
+        <w:tc>
+          <w:tcPr>
+            <w:tcW w:type="dxa" w:w="1010"/>
+            <w:tcBorders>
+              <w:top w:val="single" w:color="BBBBBB" w:sz="4"/>
+              <w:left w:val="single" w:color="BBBBBB" w:sz="4"/>
+              <w:bottom w:val="single" w:color="BBBBBB" w:sz="4"/>
+              <w:right w:val="single" w:color="BBBBBB" w:sz="4"/>
+            </w:tcBorders>
+            <w:tcMar>
+              <w:top w:type="dxa" w:w="60"/>
+              <w:left w:type="dxa" w:w="100"/>
+              <w:bottom w:type="dxa" w:w="60"/>
+              <w:right w:type="dxa" w:w="100"/>
+            </w:tcMar>
+          </w:tcPr>
+          <w:p>
+            <w:r>
+              <w:rPr>
+                <w:rFonts w:ascii="Calibri" w:cs="Calibri" w:eastAsia="Microsoft YaHei" w:hAnsi="Calibri"/>
+                <w:sz w:val="20"/>
+                <w:szCs w:val="20"/>
+              </w:rPr>
+              <w:t xml:space="preserve">Lost</w:t>
+            </w:r>
+          </w:p>
+        </w:tc>
+      </w:tr>
+      <w:tr>
+        <w:trPr>
+          <w:cantSplit/>
+          <w:tblHeader w:val="false"/>
+        </w:trPr>
+        <w:tc>
+          <w:tcPr>
+            <w:tcW w:type="dxa" w:w="1002"/>
+            <w:tcBorders>
+              <w:top w:val="single" w:color="BBBBBB" w:sz="4"/>
+              <w:left w:val="single" w:color="BBBBBB" w:sz="4"/>
+              <w:bottom w:val="single" w:color="BBBBBB" w:sz="4"/>
+              <w:right w:val="single" w:color="BBBBBB" w:sz="4"/>
+            </w:tcBorders>
+            <w:tcMar>
+              <w:top w:type="dxa" w:w="60"/>
+              <w:left w:type="dxa" w:w="100"/>
+              <w:bottom w:type="dxa" w:w="60"/>
+              <w:right w:type="dxa" w:w="100"/>
+            </w:tcMar>
+          </w:tcPr>
+          <w:p>
+            <w:r>
+              <w:rPr>
+                <w:rFonts w:ascii="Calibri" w:cs="Calibri" w:eastAsia="Microsoft YaHei" w:hAnsi="Calibri"/>
+                <w:sz w:val="20"/>
+                <w:szCs w:val="20"/>
+              </w:rPr>
+              <w:t xml:space="preserve">2</w:t>
+            </w:r>
+          </w:p>
+        </w:tc>
+        <w:tc>
+          <w:tcPr>
+            <w:tcW w:type="dxa" w:w="1002"/>
+            <w:tcBorders>
+              <w:top w:val="single" w:color="BBBBBB" w:sz="4"/>
+              <w:left w:val="single" w:color="BBBBBB" w:sz="4"/>
+              <w:bottom w:val="single" w:color="BBBBBB" w:sz="4"/>
+              <w:right w:val="single" w:color="BBBBBB" w:sz="4"/>
+            </w:tcBorders>
+            <w:tcMar>
+              <w:top w:type="dxa" w:w="60"/>
+              <w:left w:type="dxa" w:w="100"/>
+              <w:bottom w:type="dxa" w:w="60"/>
+              <w:right w:type="dxa" w:w="100"/>
+            </w:tcMar>
+          </w:tcPr>
+          <w:p>
+            <w:r>
+              <w:rPr>
+                <w:rFonts w:ascii="Calibri" w:cs="Calibri" w:eastAsia="Microsoft YaHei" w:hAnsi="Calibri"/>
+                <w:sz w:val="20"/>
+                <w:szCs w:val="20"/>
+              </w:rPr>
+              <w:t xml:space="preserve">F</w:t>
+            </w:r>
+          </w:p>
+        </w:tc>
+        <w:tc>
+          <w:tcPr>
+            <w:tcW w:type="dxa" w:w="1002"/>
+            <w:tcBorders>
+              <w:top w:val="single" w:color="BBBBBB" w:sz="4"/>
+              <w:left w:val="single" w:color="BBBBBB" w:sz="4"/>
+              <w:bottom w:val="single" w:color="BBBBBB" w:sz="4"/>
+              <w:right w:val="single" w:color="BBBBBB" w:sz="4"/>
+            </w:tcBorders>
+            <w:tcMar>
+              <w:top w:type="dxa" w:w="60"/>
+              <w:left w:type="dxa" w:w="100"/>
+              <w:bottom w:type="dxa" w:w="60"/>
+              <w:right w:type="dxa" w:w="100"/>
+            </w:tcMar>
+          </w:tcPr>
+          <w:p>
+            <w:r>
+              <w:rPr>
+                <w:rFonts w:ascii="Calibri" w:cs="Calibri" w:eastAsia="Microsoft YaHei" w:hAnsi="Calibri"/>
+                <w:sz w:val="20"/>
+                <w:szCs w:val="20"/>
+              </w:rPr>
+              <w:t xml:space="preserve">7.08</w:t>
+            </w:r>
+          </w:p>
+        </w:tc>
+        <w:tc>
+          <w:tcPr>
+            <w:tcW w:type="dxa" w:w="1002"/>
+            <w:tcBorders>
+              <w:top w:val="single" w:color="BBBBBB" w:sz="4"/>
+              <w:left w:val="single" w:color="BBBBBB" w:sz="4"/>
+              <w:bottom w:val="single" w:color="BBBBBB" w:sz="4"/>
+              <w:right w:val="single" w:color="BBBBBB" w:sz="4"/>
+            </w:tcBorders>
+            <w:tcMar>
+              <w:top w:type="dxa" w:w="60"/>
+              <w:left w:type="dxa" w:w="100"/>
+              <w:bottom w:type="dxa" w:w="60"/>
+              <w:right w:type="dxa" w:w="100"/>
+            </w:tcMar>
+          </w:tcPr>
+          <w:p>
+            <w:r>
+              <w:rPr>
+                <w:rFonts w:ascii="Calibri" w:cs="Calibri" w:eastAsia="Microsoft YaHei" w:hAnsi="Calibri"/>
+                <w:sz w:val="20"/>
+                <w:szCs w:val="20"/>
+              </w:rPr>
+              <w:t xml:space="preserve">1 ᵃ</w:t>
+            </w:r>
+          </w:p>
+        </w:tc>
+        <w:tc>
+          <w:tcPr>
+            <w:tcW w:type="dxa" w:w="1002"/>
+            <w:tcBorders>
+              <w:top w:val="single" w:color="BBBBBB" w:sz="4"/>
+              <w:left w:val="single" w:color="BBBBBB" w:sz="4"/>
+              <w:bottom w:val="single" w:color="BBBBBB" w:sz="4"/>
+              <w:right w:val="single" w:color="BBBBBB" w:sz="4"/>
+            </w:tcBorders>
+            <w:tcMar>
+              <w:top w:type="dxa" w:w="60"/>
+              <w:left w:type="dxa" w:w="100"/>
+              <w:bottom w:type="dxa" w:w="60"/>
+              <w:right w:type="dxa" w:w="100"/>
+            </w:tcMar>
+          </w:tcPr>
+          <w:p>
+            <w:r>
+              <w:rPr>
+                <w:rFonts w:ascii="Calibri" w:cs="Calibri" w:eastAsia="Microsoft YaHei" w:hAnsi="Calibri"/>
+                <w:sz w:val="20"/>
+                <w:szCs w:val="20"/>
+              </w:rPr>
+              <w:t xml:space="preserve">Known; operation declined, readmitted after 19 months</w:t>
+            </w:r>
+          </w:p>
+        </w:tc>
+        <w:tc>
+          <w:tcPr>
+            <w:tcW w:type="dxa" w:w="1002"/>
+            <w:tcBorders>
+              <w:top w:val="single" w:color="BBBBBB" w:sz="4"/>
+              <w:left w:val="single" w:color="BBBBBB" w:sz="4"/>
+              <w:bottom w:val="single" w:color="BBBBBB" w:sz="4"/>
+              <w:right w:val="single" w:color="BBBBBB" w:sz="4"/>
+            </w:tcBorders>
+            <w:tcMar>
+              <w:top w:type="dxa" w:w="60"/>
+              <w:left w:type="dxa" w:w="100"/>
+              <w:bottom w:type="dxa" w:w="60"/>
+              <w:right w:type="dxa" w:w="100"/>
+            </w:tcMar>
+          </w:tcPr>
+          <w:p>
+            <w:r>
+              <w:rPr>
+                <w:rFonts w:ascii="Calibri" w:cs="Calibri" w:eastAsia="Microsoft YaHei" w:hAnsi="Calibri"/>
+                <w:sz w:val="20"/>
+                <w:szCs w:val="20"/>
+              </w:rPr>
+              <w:t xml:space="preserve">525</w:t>
+            </w:r>
+          </w:p>
+        </w:tc>
+        <w:tc>
+          <w:tcPr>
+            <w:tcW w:type="dxa" w:w="1002"/>
+            <w:tcBorders>
+              <w:top w:val="single" w:color="BBBBBB" w:sz="4"/>
+              <w:left w:val="single" w:color="BBBBBB" w:sz="4"/>
+              <w:bottom w:val="single" w:color="BBBBBB" w:sz="4"/>
+              <w:right w:val="single" w:color="BBBBBB" w:sz="4"/>
+            </w:tcBorders>
+            <w:tcMar>
+              <w:top w:type="dxa" w:w="60"/>
+              <w:left w:type="dxa" w:w="100"/>
+              <w:bottom w:type="dxa" w:w="60"/>
+              <w:right w:type="dxa" w:w="100"/>
+            </w:tcMar>
+          </w:tcPr>
+          <w:p>
+            <w:r>
+              <w:rPr>
+                <w:rFonts w:ascii="Calibri" w:cs="Calibri" w:eastAsia="Microsoft YaHei" w:hAnsi="Calibri"/>
+                <w:sz w:val="20"/>
+                <w:szCs w:val="20"/>
+              </w:rPr>
+              <w:t xml:space="preserve">Total splenectomy (laparoscopy converted to laparotomy)</w:t>
+            </w:r>
+          </w:p>
+        </w:tc>
+        <w:tc>
+          <w:tcPr>
+            <w:tcW w:type="dxa" w:w="1002"/>
+            <w:tcBorders>
+              <w:top w:val="single" w:color="BBBBBB" w:sz="4"/>
+              <w:left w:val="single" w:color="BBBBBB" w:sz="4"/>
+              <w:bottom w:val="single" w:color="BBBBBB" w:sz="4"/>
+              <w:right w:val="single" w:color="BBBBBB" w:sz="4"/>
+            </w:tcBorders>
+            <w:tcMar>
+              <w:top w:type="dxa" w:w="60"/>
+              <w:left w:type="dxa" w:w="100"/>
+              <w:bottom w:type="dxa" w:w="60"/>
+              <w:right w:type="dxa" w:w="100"/>
+            </w:tcMar>
+          </w:tcPr>
+          <w:p>
+            <w:r>
+              <w:rPr>
+                <w:rFonts w:ascii="Calibri" w:cs="Calibri" w:eastAsia="Microsoft YaHei" w:hAnsi="Calibri"/>
+                <w:sz w:val="20"/>
+                <w:szCs w:val="20"/>
+              </w:rPr>
+              <w:t xml:space="preserve">Non-viable</w:t>
+            </w:r>
+          </w:p>
+        </w:tc>
+        <w:tc>
+          <w:tcPr>
+            <w:tcW w:type="dxa" w:w="1010"/>
+            <w:tcBorders>
+              <w:top w:val="single" w:color="BBBBBB" w:sz="4"/>
+              <w:left w:val="single" w:color="BBBBBB" w:sz="4"/>
+              <w:bottom w:val="single" w:color="BBBBBB" w:sz="4"/>
+              <w:right w:val="single" w:color="BBBBBB" w:sz="4"/>
+            </w:tcBorders>
+            <w:tcMar>
+              <w:top w:type="dxa" w:w="60"/>
+              <w:left w:type="dxa" w:w="100"/>
+              <w:bottom w:type="dxa" w:w="60"/>
+              <w:right w:type="dxa" w:w="100"/>
+            </w:tcMar>
+          </w:tcPr>
+          <w:p>
+            <w:r>
+              <w:rPr>
+                <w:rFonts w:ascii="Calibri" w:cs="Calibri" w:eastAsia="Microsoft YaHei" w:hAnsi="Calibri"/>
+                <w:sz w:val="20"/>
+                <w:szCs w:val="20"/>
+              </w:rPr>
+              <w:t xml:space="preserve">Lost</w:t>
+            </w:r>
+          </w:p>
+        </w:tc>
+      </w:tr>
+      <w:tr>
+        <w:trPr>
+          <w:cantSplit/>
+          <w:tblHeader w:val="false"/>
+        </w:trPr>
+        <w:tc>
+          <w:tcPr>
+            <w:tcW w:type="dxa" w:w="1002"/>
+            <w:tcBorders>
+              <w:top w:val="single" w:color="BBBBBB" w:sz="4"/>
+              <w:left w:val="single" w:color="BBBBBB" w:sz="4"/>
+              <w:bottom w:val="single" w:color="BBBBBB" w:sz="4"/>
+              <w:right w:val="single" w:color="BBBBBB" w:sz="4"/>
+            </w:tcBorders>
+            <w:tcMar>
+              <w:top w:type="dxa" w:w="60"/>
+              <w:left w:type="dxa" w:w="100"/>
+              <w:bottom w:type="dxa" w:w="60"/>
+              <w:right w:type="dxa" w:w="100"/>
+            </w:tcMar>
+          </w:tcPr>
+          <w:p>
+            <w:r>
+              <w:rPr>
+                <w:rFonts w:ascii="Calibri" w:cs="Calibri" w:eastAsia="Microsoft YaHei" w:hAnsi="Calibri"/>
+                <w:sz w:val="20"/>
+                <w:szCs w:val="20"/>
+              </w:rPr>
+              <w:t xml:space="preserve">3</w:t>
+            </w:r>
+          </w:p>
+        </w:tc>
+        <w:tc>
+          <w:tcPr>
+            <w:tcW w:type="dxa" w:w="1002"/>
+            <w:tcBorders>
+              <w:top w:val="single" w:color="BBBBBB" w:sz="4"/>
+              <w:left w:val="single" w:color="BBBBBB" w:sz="4"/>
+              <w:bottom w:val="single" w:color="BBBBBB" w:sz="4"/>
+              <w:right w:val="single" w:color="BBBBBB" w:sz="4"/>
+            </w:tcBorders>
+            <w:tcMar>
+              <w:top w:type="dxa" w:w="60"/>
+              <w:left w:type="dxa" w:w="100"/>
+              <w:bottom w:type="dxa" w:w="60"/>
+              <w:right w:type="dxa" w:w="100"/>
+            </w:tcMar>
+          </w:tcPr>
+          <w:p>
+            <w:r>
+              <w:rPr>
+                <w:rFonts w:ascii="Calibri" w:cs="Calibri" w:eastAsia="Microsoft YaHei" w:hAnsi="Calibri"/>
+                <w:sz w:val="20"/>
+                <w:szCs w:val="20"/>
+              </w:rPr>
+              <w:t xml:space="preserve">F</w:t>
+            </w:r>
+          </w:p>
+        </w:tc>
+        <w:tc>
+          <w:tcPr>
+            <w:tcW w:type="dxa" w:w="1002"/>
+            <w:tcBorders>
+              <w:top w:val="single" w:color="BBBBBB" w:sz="4"/>
+              <w:left w:val="single" w:color="BBBBBB" w:sz="4"/>
+              <w:bottom w:val="single" w:color="BBBBBB" w:sz="4"/>
+              <w:right w:val="single" w:color="BBBBBB" w:sz="4"/>
+            </w:tcBorders>
+            <w:tcMar>
+              <w:top w:type="dxa" w:w="60"/>
+              <w:left w:type="dxa" w:w="100"/>
+              <w:bottom w:type="dxa" w:w="60"/>
+              <w:right w:type="dxa" w:w="100"/>
+            </w:tcMar>
+          </w:tcPr>
+          <w:p>
+            <w:r>
+              <w:rPr>
+                <w:rFonts w:ascii="Calibri" w:cs="Calibri" w:eastAsia="Microsoft YaHei" w:hAnsi="Calibri"/>
+                <w:sz w:val="20"/>
+                <w:szCs w:val="20"/>
+              </w:rPr>
+              <w:t xml:space="preserve">9.67</w:t>
+            </w:r>
+          </w:p>
+        </w:tc>
+        <w:tc>
+          <w:tcPr>
+            <w:tcW w:type="dxa" w:w="1002"/>
+            <w:tcBorders>
+              <w:top w:val="single" w:color="BBBBBB" w:sz="4"/>
+              <w:left w:val="single" w:color="BBBBBB" w:sz="4"/>
+              <w:bottom w:val="single" w:color="BBBBBB" w:sz="4"/>
+              <w:right w:val="single" w:color="BBBBBB" w:sz="4"/>
+            </w:tcBorders>
+            <w:tcMar>
+              <w:top w:type="dxa" w:w="60"/>
+              <w:left w:type="dxa" w:w="100"/>
+              <w:bottom w:type="dxa" w:w="60"/>
+              <w:right w:type="dxa" w:w="100"/>
+            </w:tcMar>
+          </w:tcPr>
+          <w:p>
+            <w:r>
+              <w:rPr>
+                <w:rFonts w:ascii="Calibri" w:cs="Calibri" w:eastAsia="Microsoft YaHei" w:hAnsi="Calibri"/>
+                <w:sz w:val="20"/>
+                <w:szCs w:val="20"/>
+              </w:rPr>
+              <w:t xml:space="preserve">9 ᵇ</w:t>
+            </w:r>
+          </w:p>
+        </w:tc>
+        <w:tc>
+          <w:tcPr>
+            <w:tcW w:type="dxa" w:w="1002"/>
+            <w:tcBorders>
+              <w:top w:val="single" w:color="BBBBBB" w:sz="4"/>
+              <w:left w:val="single" w:color="BBBBBB" w:sz="4"/>
+              <w:bottom w:val="single" w:color="BBBBBB" w:sz="4"/>
+              <w:right w:val="single" w:color="BBBBBB" w:sz="4"/>
+            </w:tcBorders>
+            <w:tcMar>
+              <w:top w:type="dxa" w:w="60"/>
+              <w:left w:type="dxa" w:w="100"/>
+              <w:bottom w:type="dxa" w:w="60"/>
+              <w:right w:type="dxa" w:w="100"/>
+            </w:tcMar>
+          </w:tcPr>
+          <w:p>
+            <w:r>
+              <w:rPr>
+                <w:rFonts w:ascii="Calibri" w:cs="Calibri" w:eastAsia="Microsoft YaHei" w:hAnsi="Calibri"/>
+                <w:sz w:val="20"/>
+                <w:szCs w:val="20"/>
+              </w:rPr>
+              <w:t xml:space="preserve">Known; operation declined at the first presentation, first splenic operation after 62 months</w:t>
+            </w:r>
+          </w:p>
+        </w:tc>
+        <w:tc>
+          <w:tcPr>
+            <w:tcW w:type="dxa" w:w="1002"/>
+            <w:tcBorders>
+              <w:top w:val="single" w:color="BBBBBB" w:sz="4"/>
+              <w:left w:val="single" w:color="BBBBBB" w:sz="4"/>
+              <w:bottom w:val="single" w:color="BBBBBB" w:sz="4"/>
+              <w:right w:val="single" w:color="BBBBBB" w:sz="4"/>
+            </w:tcBorders>
+            <w:tcMar>
+              <w:top w:type="dxa" w:w="60"/>
+              <w:left w:type="dxa" w:w="100"/>
+              <w:bottom w:type="dxa" w:w="60"/>
+              <w:right w:type="dxa" w:w="100"/>
+            </w:tcMar>
+          </w:tcPr>
+          <w:p>
+            <w:r>
+              <w:rPr>
+                <w:rFonts w:ascii="Calibri" w:cs="Calibri" w:eastAsia="Microsoft YaHei" w:hAnsi="Calibri"/>
+                <w:sz w:val="20"/>
+                <w:szCs w:val="20"/>
+              </w:rPr>
+              <w:t xml:space="preserve">172</w:t>
+            </w:r>
+          </w:p>
+        </w:tc>
+        <w:tc>
+          <w:tcPr>
+            <w:tcW w:type="dxa" w:w="1002"/>
+            <w:tcBorders>
+              <w:top w:val="single" w:color="BBBBBB" w:sz="4"/>
+              <w:left w:val="single" w:color="BBBBBB" w:sz="4"/>
+              <w:bottom w:val="single" w:color="BBBBBB" w:sz="4"/>
+              <w:right w:val="single" w:color="BBBBBB" w:sz="4"/>
+            </w:tcBorders>
+            <w:tcMar>
+              <w:top w:type="dxa" w:w="60"/>
+              <w:left w:type="dxa" w:w="100"/>
+              <w:bottom w:type="dxa" w:w="60"/>
+              <w:right w:type="dxa" w:w="100"/>
+            </w:tcMar>
+          </w:tcPr>
+          <w:p>
+            <w:r>
+              <w:rPr>
+                <w:rFonts w:ascii="Calibri" w:cs="Calibri" w:eastAsia="Microsoft YaHei" w:hAnsi="Calibri"/>
+                <w:sz w:val="20"/>
+                <w:szCs w:val="20"/>
+              </w:rPr>
+              <w:t xml:space="preserve">Partial splenectomy with capsular splenopexy</w:t>
+            </w:r>
+          </w:p>
+        </w:tc>
+        <w:tc>
+          <w:tcPr>
+            <w:tcW w:type="dxa" w:w="1002"/>
+            <w:tcBorders>
+              <w:top w:val="single" w:color="BBBBBB" w:sz="4"/>
+              <w:left w:val="single" w:color="BBBBBB" w:sz="4"/>
+              <w:bottom w:val="single" w:color="BBBBBB" w:sz="4"/>
+              <w:right w:val="single" w:color="BBBBBB" w:sz="4"/>
+            </w:tcBorders>
+            <w:tcMar>
+              <w:top w:type="dxa" w:w="60"/>
+              <w:left w:type="dxa" w:w="100"/>
+              <w:bottom w:type="dxa" w:w="60"/>
+              <w:right w:type="dxa" w:w="100"/>
+            </w:tcMar>
+          </w:tcPr>
+          <w:p>
+            <w:r>
+              <w:rPr>
+                <w:rFonts w:ascii="Calibri" w:cs="Calibri" w:eastAsia="Microsoft YaHei" w:hAnsi="Calibri"/>
+                <w:sz w:val="20"/>
+                <w:szCs w:val="20"/>
+              </w:rPr>
+              <w:t xml:space="preserve">Partly non-viable ᶜ</w:t>
+            </w:r>
+          </w:p>
+        </w:tc>
+        <w:tc>
+          <w:tcPr>
+            <w:tcW w:type="dxa" w:w="1010"/>
+            <w:tcBorders>
+              <w:top w:val="single" w:color="BBBBBB" w:sz="4"/>
+              <w:left w:val="single" w:color="BBBBBB" w:sz="4"/>
+              <w:bottom w:val="single" w:color="BBBBBB" w:sz="4"/>
+              <w:right w:val="single" w:color="BBBBBB" w:sz="4"/>
+            </w:tcBorders>
+            <w:tcMar>
+              <w:top w:type="dxa" w:w="60"/>
+              <w:left w:type="dxa" w:w="100"/>
+              <w:bottom w:type="dxa" w:w="60"/>
+              <w:right w:type="dxa" w:w="100"/>
+            </w:tcMar>
+          </w:tcPr>
+          <w:p>
+            <w:r>
+              <w:rPr>
+                <w:rFonts w:ascii="Calibri" w:cs="Calibri" w:eastAsia="Microsoft YaHei" w:hAnsi="Calibri"/>
+                <w:sz w:val="20"/>
+                <w:szCs w:val="20"/>
+              </w:rPr>
+              <w:t xml:space="preserve">Lost; total splenectomy after recurrence at 1 month</w:t>
+            </w:r>
+          </w:p>
+        </w:tc>
+      </w:tr>
+      <w:tr>
+        <w:trPr>
+          <w:cantSplit/>
+          <w:tblHeader w:val="false"/>
+        </w:trPr>
+        <w:tc>
+          <w:tcPr>
+            <w:tcW w:type="dxa" w:w="1002"/>
+            <w:tcBorders>
+              <w:top w:val="single" w:color="BBBBBB" w:sz="4"/>
+              <w:left w:val="single" w:color="BBBBBB" w:sz="4"/>
+              <w:bottom w:val="single" w:color="BBBBBB" w:sz="4"/>
+              <w:right w:val="single" w:color="BBBBBB" w:sz="4"/>
+            </w:tcBorders>
+            <w:tcMar>
+              <w:top w:type="dxa" w:w="60"/>
+              <w:left w:type="dxa" w:w="100"/>
+              <w:bottom w:type="dxa" w:w="60"/>
+              <w:right w:type="dxa" w:w="100"/>
+            </w:tcMar>
+          </w:tcPr>
+          <w:p>
+            <w:r>
+              <w:rPr>
+                <w:rFonts w:ascii="Calibri" w:cs="Calibri" w:eastAsia="Microsoft YaHei" w:hAnsi="Calibri"/>
+                <w:sz w:val="20"/>
+                <w:szCs w:val="20"/>
+              </w:rPr>
+              <w:t xml:space="preserve">4</w:t>
+            </w:r>
+          </w:p>
+        </w:tc>
+        <w:tc>
+          <w:tcPr>
+            <w:tcW w:type="dxa" w:w="1002"/>
+            <w:tcBorders>
+              <w:top w:val="single" w:color="BBBBBB" w:sz="4"/>
+              <w:left w:val="single" w:color="BBBBBB" w:sz="4"/>
+              <w:bottom w:val="single" w:color="BBBBBB" w:sz="4"/>
+              <w:right w:val="single" w:color="BBBBBB" w:sz="4"/>
+            </w:tcBorders>
+            <w:tcMar>
+              <w:top w:type="dxa" w:w="60"/>
+              <w:left w:type="dxa" w:w="100"/>
+              <w:bottom w:type="dxa" w:w="60"/>
+              <w:right w:type="dxa" w:w="100"/>
+            </w:tcMar>
+          </w:tcPr>
+          <w:p>
+            <w:r>
+              <w:rPr>
+                <w:rFonts w:ascii="Calibri" w:cs="Calibri" w:eastAsia="Microsoft YaHei" w:hAnsi="Calibri"/>
+                <w:sz w:val="20"/>
+                <w:szCs w:val="20"/>
+              </w:rPr>
+              <w:t xml:space="preserve">M</w:t>
+            </w:r>
+          </w:p>
+        </w:tc>
+        <w:tc>
+          <w:tcPr>
+            <w:tcW w:type="dxa" w:w="1002"/>
+            <w:tcBorders>
+              <w:top w:val="single" w:color="BBBBBB" w:sz="4"/>
+              <w:left w:val="single" w:color="BBBBBB" w:sz="4"/>
+              <w:bottom w:val="single" w:color="BBBBBB" w:sz="4"/>
+              <w:right w:val="single" w:color="BBBBBB" w:sz="4"/>
+            </w:tcBorders>
+            <w:tcMar>
+              <w:top w:type="dxa" w:w="60"/>
+              <w:left w:type="dxa" w:w="100"/>
+              <w:bottom w:type="dxa" w:w="60"/>
+              <w:right w:type="dxa" w:w="100"/>
+            </w:tcMar>
+          </w:tcPr>
+          <w:p>
+            <w:r>
+              <w:rPr>
+                <w:rFonts w:ascii="Calibri" w:cs="Calibri" w:eastAsia="Microsoft YaHei" w:hAnsi="Calibri"/>
+                <w:sz w:val="20"/>
+                <w:szCs w:val="20"/>
+              </w:rPr>
+              <w:t xml:space="preserve">2.75</w:t>
+            </w:r>
+          </w:p>
+        </w:tc>
+        <w:tc>
+          <w:tcPr>
+            <w:tcW w:type="dxa" w:w="1002"/>
+            <w:tcBorders>
+              <w:top w:val="single" w:color="BBBBBB" w:sz="4"/>
+              <w:left w:val="single" w:color="BBBBBB" w:sz="4"/>
+              <w:bottom w:val="single" w:color="BBBBBB" w:sz="4"/>
+              <w:right w:val="single" w:color="BBBBBB" w:sz="4"/>
+            </w:tcBorders>
+            <w:tcMar>
+              <w:top w:type="dxa" w:w="60"/>
+              <w:left w:type="dxa" w:w="100"/>
+              <w:bottom w:type="dxa" w:w="60"/>
+              <w:right w:type="dxa" w:w="100"/>
+            </w:tcMar>
+          </w:tcPr>
+          <w:p>
+            <w:r>
+              <w:rPr>
+                <w:rFonts w:ascii="Calibri" w:cs="Calibri" w:eastAsia="Microsoft YaHei" w:hAnsi="Calibri"/>
+                <w:sz w:val="20"/>
+                <w:szCs w:val="20"/>
+              </w:rPr>
+              <w:t xml:space="preserve">0.1 ᵃ</w:t>
+            </w:r>
+          </w:p>
+        </w:tc>
+        <w:tc>
+          <w:tcPr>
+            <w:tcW w:type="dxa" w:w="1002"/>
+            <w:tcBorders>
+              <w:top w:val="single" w:color="BBBBBB" w:sz="4"/>
+              <w:left w:val="single" w:color="BBBBBB" w:sz="4"/>
+              <w:bottom w:val="single" w:color="BBBBBB" w:sz="4"/>
+              <w:right w:val="single" w:color="BBBBBB" w:sz="4"/>
+            </w:tcBorders>
+            <w:tcMar>
+              <w:top w:type="dxa" w:w="60"/>
+              <w:left w:type="dxa" w:w="100"/>
+              <w:bottom w:type="dxa" w:w="60"/>
+              <w:right w:type="dxa" w:w="100"/>
+            </w:tcMar>
+          </w:tcPr>
+          <w:p>
+            <w:r>
+              <w:rPr>
+                <w:rFonts w:ascii="Calibri" w:cs="Calibri" w:eastAsia="Microsoft YaHei" w:hAnsi="Calibri"/>
+                <w:sz w:val="20"/>
+                <w:szCs w:val="20"/>
+              </w:rPr>
+              <w:t xml:space="preserve">Diagnosed at presentation; operated at once</w:t>
+            </w:r>
+          </w:p>
+        </w:tc>
+        <w:tc>
+          <w:tcPr>
+            <w:tcW w:type="dxa" w:w="1002"/>
+            <w:tcBorders>
+              <w:top w:val="single" w:color="BBBBBB" w:sz="4"/>
+              <w:left w:val="single" w:color="BBBBBB" w:sz="4"/>
+              <w:bottom w:val="single" w:color="BBBBBB" w:sz="4"/>
+              <w:right w:val="single" w:color="BBBBBB" w:sz="4"/>
+            </w:tcBorders>
+            <w:tcMar>
+              <w:top w:type="dxa" w:w="60"/>
+              <w:left w:type="dxa" w:w="100"/>
+              <w:bottom w:type="dxa" w:w="60"/>
+              <w:right w:type="dxa" w:w="100"/>
+            </w:tcMar>
+          </w:tcPr>
+          <w:p>
+            <w:r>
+              <w:rPr>
+                <w:rFonts w:ascii="Calibri" w:cs="Calibri" w:eastAsia="Microsoft YaHei" w:hAnsi="Calibri"/>
+                <w:sz w:val="20"/>
+                <w:szCs w:val="20"/>
+              </w:rPr>
+              <w:t xml:space="preserve">177</w:t>
+            </w:r>
+          </w:p>
+        </w:tc>
+        <w:tc>
+          <w:tcPr>
+            <w:tcW w:type="dxa" w:w="1002"/>
+            <w:tcBorders>
+              <w:top w:val="single" w:color="BBBBBB" w:sz="4"/>
+              <w:left w:val="single" w:color="BBBBBB" w:sz="4"/>
+              <w:bottom w:val="single" w:color="BBBBBB" w:sz="4"/>
+              <w:right w:val="single" w:color="BBBBBB" w:sz="4"/>
+            </w:tcBorders>
+            <w:tcMar>
+              <w:top w:type="dxa" w:w="60"/>
+              <w:left w:type="dxa" w:w="100"/>
+              <w:bottom w:type="dxa" w:w="60"/>
+              <w:right w:type="dxa" w:w="100"/>
+            </w:tcMar>
+          </w:tcPr>
+          <w:p>
+            <w:r>
+              <w:rPr>
+                <w:rFonts w:ascii="Calibri" w:cs="Calibri" w:eastAsia="Microsoft YaHei" w:hAnsi="Calibri"/>
+                <w:sz w:val="20"/>
+                <w:szCs w:val="20"/>
+              </w:rPr>
+              <w:t xml:space="preserve">Gastric repair and reinforced two-pole splenopexy</w:t>
+            </w:r>
+          </w:p>
+        </w:tc>
+        <w:tc>
+          <w:tcPr>
+            <w:tcW w:type="dxa" w:w="1002"/>
+            <w:tcBorders>
+              <w:top w:val="single" w:color="BBBBBB" w:sz="4"/>
+              <w:left w:val="single" w:color="BBBBBB" w:sz="4"/>
+              <w:bottom w:val="single" w:color="BBBBBB" w:sz="4"/>
+              <w:right w:val="single" w:color="BBBBBB" w:sz="4"/>
+            </w:tcBorders>
+            <w:tcMar>
+              <w:top w:type="dxa" w:w="60"/>
+              <w:left w:type="dxa" w:w="100"/>
+              <w:bottom w:type="dxa" w:w="60"/>
+              <w:right w:type="dxa" w:w="100"/>
+            </w:tcMar>
+          </w:tcPr>
+          <w:p>
+            <w:r>
+              <w:rPr>
+                <w:rFonts w:ascii="Calibri" w:cs="Calibri" w:eastAsia="Microsoft YaHei" w:hAnsi="Calibri"/>
+                <w:sz w:val="20"/>
+                <w:szCs w:val="20"/>
+              </w:rPr>
+              <w:t xml:space="preserve">Viable</w:t>
+            </w:r>
+          </w:p>
+        </w:tc>
+        <w:tc>
+          <w:tcPr>
+            <w:tcW w:type="dxa" w:w="1010"/>
+            <w:tcBorders>
+              <w:top w:val="single" w:color="BBBBBB" w:sz="4"/>
+              <w:left w:val="single" w:color="BBBBBB" w:sz="4"/>
+              <w:bottom w:val="single" w:color="BBBBBB" w:sz="4"/>
+              <w:right w:val="single" w:color="BBBBBB" w:sz="4"/>
+            </w:tcBorders>
+            <w:tcMar>
+              <w:top w:type="dxa" w:w="60"/>
+              <w:left w:type="dxa" w:w="100"/>
+              <w:bottom w:type="dxa" w:w="60"/>
+              <w:right w:type="dxa" w:w="100"/>
+            </w:tcMar>
+          </w:tcPr>
+          <w:p>
+            <w:r>
+              <w:rPr>
+                <w:rFonts w:ascii="Calibri" w:cs="Calibri" w:eastAsia="Microsoft YaHei" w:hAnsi="Calibri"/>
+                <w:sz w:val="20"/>
+                <w:szCs w:val="20"/>
+              </w:rPr>
+              <w:t xml:space="preserve">Preserved; well at 13 months</w:t>
+            </w:r>
+          </w:p>
+        </w:tc>
+      </w:tr>
+      <w:tr>
+        <w:trPr>
+          <w:cantSplit/>
+          <w:tblHeader w:val="false"/>
+        </w:trPr>
+        <w:tc>
+          <w:tcPr>
+            <w:tcW w:type="dxa" w:w="1002"/>
+            <w:tcBorders>
+              <w:top w:val="single" w:color="BBBBBB" w:sz="4"/>
+              <w:left w:val="single" w:color="BBBBBB" w:sz="4"/>
+              <w:bottom w:val="single" w:color="BBBBBB" w:sz="4"/>
+              <w:right w:val="single" w:color="BBBBBB" w:sz="4"/>
+            </w:tcBorders>
+            <w:tcMar>
+              <w:top w:type="dxa" w:w="60"/>
+              <w:left w:type="dxa" w:w="100"/>
+              <w:bottom w:type="dxa" w:w="60"/>
+              <w:right w:type="dxa" w:w="100"/>
+            </w:tcMar>
+          </w:tcPr>
+          <w:p>
+            <w:r>
+              <w:rPr>
+                <w:rFonts w:ascii="Calibri" w:cs="Calibri" w:eastAsia="Microsoft YaHei" w:hAnsi="Calibri"/>
+                <w:sz w:val="20"/>
+                <w:szCs w:val="20"/>
+              </w:rPr>
+              <w:t xml:space="preserve">5</w:t>
+            </w:r>
+          </w:p>
+        </w:tc>
+        <w:tc>
+          <w:tcPr>
+            <w:tcW w:type="dxa" w:w="1002"/>
+            <w:tcBorders>
+              <w:top w:val="single" w:color="BBBBBB" w:sz="4"/>
+              <w:left w:val="single" w:color="BBBBBB" w:sz="4"/>
+              <w:bottom w:val="single" w:color="BBBBBB" w:sz="4"/>
+              <w:right w:val="single" w:color="BBBBBB" w:sz="4"/>
+            </w:tcBorders>
+            <w:tcMar>
+              <w:top w:type="dxa" w:w="60"/>
+              <w:left w:type="dxa" w:w="100"/>
+              <w:bottom w:type="dxa" w:w="60"/>
+              <w:right w:type="dxa" w:w="100"/>
+            </w:tcMar>
+          </w:tcPr>
+          <w:p>
+            <w:r>
+              <w:rPr>
+                <w:rFonts w:ascii="Calibri" w:cs="Calibri" w:eastAsia="Microsoft YaHei" w:hAnsi="Calibri"/>
+                <w:sz w:val="20"/>
+                <w:szCs w:val="20"/>
+              </w:rPr>
+              <w:t xml:space="preserve">M</w:t>
+            </w:r>
+          </w:p>
+        </w:tc>
+        <w:tc>
+          <w:tcPr>
+            <w:tcW w:type="dxa" w:w="1002"/>
+            <w:tcBorders>
+              <w:top w:val="single" w:color="BBBBBB" w:sz="4"/>
+              <w:left w:val="single" w:color="BBBBBB" w:sz="4"/>
+              <w:bottom w:val="single" w:color="BBBBBB" w:sz="4"/>
+              <w:right w:val="single" w:color="BBBBBB" w:sz="4"/>
+            </w:tcBorders>
+            <w:tcMar>
+              <w:top w:type="dxa" w:w="60"/>
+              <w:left w:type="dxa" w:w="100"/>
+              <w:bottom w:type="dxa" w:w="60"/>
+              <w:right w:type="dxa" w:w="100"/>
+            </w:tcMar>
+          </w:tcPr>
+          <w:p>
+            <w:r>
+              <w:rPr>
+                <w:rFonts w:ascii="Calibri" w:cs="Calibri" w:eastAsia="Microsoft YaHei" w:hAnsi="Calibri"/>
+                <w:sz w:val="20"/>
+                <w:szCs w:val="20"/>
+              </w:rPr>
+              <w:t xml:space="preserve">13.08</w:t>
+            </w:r>
+          </w:p>
+        </w:tc>
+        <w:tc>
+          <w:tcPr>
+            <w:tcW w:type="dxa" w:w="1002"/>
+            <w:tcBorders>
+              <w:top w:val="single" w:color="BBBBBB" w:sz="4"/>
+              <w:left w:val="single" w:color="BBBBBB" w:sz="4"/>
+              <w:bottom w:val="single" w:color="BBBBBB" w:sz="4"/>
+              <w:right w:val="single" w:color="BBBBBB" w:sz="4"/>
+            </w:tcBorders>
+            <w:tcMar>
+              <w:top w:type="dxa" w:w="60"/>
+              <w:left w:type="dxa" w:w="100"/>
+              <w:bottom w:type="dxa" w:w="60"/>
+              <w:right w:type="dxa" w:w="100"/>
+            </w:tcMar>
+          </w:tcPr>
+          <w:p>
+            <w:r>
+              <w:rPr>
+                <w:rFonts w:ascii="Calibri" w:cs="Calibri" w:eastAsia="Microsoft YaHei" w:hAnsi="Calibri"/>
+                <w:sz w:val="20"/>
+                <w:szCs w:val="20"/>
+              </w:rPr>
+              <w:t xml:space="preserve">0.9</w:t>
+            </w:r>
+          </w:p>
+        </w:tc>
+        <w:tc>
+          <w:tcPr>
+            <w:tcW w:type="dxa" w:w="1002"/>
+            <w:tcBorders>
+              <w:top w:val="single" w:color="BBBBBB" w:sz="4"/>
+              <w:left w:val="single" w:color="BBBBBB" w:sz="4"/>
+              <w:bottom w:val="single" w:color="BBBBBB" w:sz="4"/>
+              <w:right w:val="single" w:color="BBBBBB" w:sz="4"/>
+            </w:tcBorders>
+            <w:tcMar>
+              <w:top w:type="dxa" w:w="60"/>
+              <w:left w:type="dxa" w:w="100"/>
+              <w:bottom w:type="dxa" w:w="60"/>
+              <w:right w:type="dxa" w:w="100"/>
+            </w:tcMar>
+          </w:tcPr>
+          <w:p>
+            <w:r>
+              <w:rPr>
+                <w:rFonts w:ascii="Calibri" w:cs="Calibri" w:eastAsia="Microsoft YaHei" w:hAnsi="Calibri"/>
+                <w:sz w:val="20"/>
+                <w:szCs w:val="20"/>
+              </w:rPr>
+              <w:t xml:space="preserve">Missed; treated as acute gastritis one week earlier</w:t>
+            </w:r>
+          </w:p>
+        </w:tc>
+        <w:tc>
+          <w:tcPr>
+            <w:tcW w:type="dxa" w:w="1002"/>
+            <w:tcBorders>
+              <w:top w:val="single" w:color="BBBBBB" w:sz="4"/>
+              <w:left w:val="single" w:color="BBBBBB" w:sz="4"/>
+              <w:bottom w:val="single" w:color="BBBBBB" w:sz="4"/>
+              <w:right w:val="single" w:color="BBBBBB" w:sz="4"/>
+            </w:tcBorders>
+            <w:tcMar>
+              <w:top w:type="dxa" w:w="60"/>
+              <w:left w:type="dxa" w:w="100"/>
+              <w:bottom w:type="dxa" w:w="60"/>
+              <w:right w:type="dxa" w:w="100"/>
+            </w:tcMar>
+          </w:tcPr>
+          <w:p>
+            <w:r>
+              <w:rPr>
+                <w:rFonts w:ascii="Calibri" w:cs="Calibri" w:eastAsia="Microsoft YaHei" w:hAnsi="Calibri"/>
+                <w:sz w:val="20"/>
+                <w:szCs w:val="20"/>
+              </w:rPr>
+              <w:t xml:space="preserve">Normal ᵈ</w:t>
+            </w:r>
+          </w:p>
+        </w:tc>
+        <w:tc>
+          <w:tcPr>
+            <w:tcW w:type="dxa" w:w="1002"/>
+            <w:tcBorders>
+              <w:top w:val="single" w:color="BBBBBB" w:sz="4"/>
+              <w:left w:val="single" w:color="BBBBBB" w:sz="4"/>
+              <w:bottom w:val="single" w:color="BBBBBB" w:sz="4"/>
+              <w:right w:val="single" w:color="BBBBBB" w:sz="4"/>
+            </w:tcBorders>
+            <w:tcMar>
+              <w:top w:type="dxa" w:w="60"/>
+              <w:left w:type="dxa" w:w="100"/>
+              <w:bottom w:type="dxa" w:w="60"/>
+              <w:right w:type="dxa" w:w="100"/>
+            </w:tcMar>
+          </w:tcPr>
+          <w:p>
+            <w:r>
+              <w:rPr>
+                <w:rFonts w:ascii="Calibri" w:cs="Calibri" w:eastAsia="Microsoft YaHei" w:hAnsi="Calibri"/>
+                <w:sz w:val="20"/>
+                <w:szCs w:val="20"/>
+              </w:rPr>
+              <w:t xml:space="preserve">Total splenectomy (laparotomy)</w:t>
+            </w:r>
+          </w:p>
+        </w:tc>
+        <w:tc>
+          <w:tcPr>
+            <w:tcW w:type="dxa" w:w="1002"/>
+            <w:tcBorders>
+              <w:top w:val="single" w:color="BBBBBB" w:sz="4"/>
+              <w:left w:val="single" w:color="BBBBBB" w:sz="4"/>
+              <w:bottom w:val="single" w:color="BBBBBB" w:sz="4"/>
+              <w:right w:val="single" w:color="BBBBBB" w:sz="4"/>
+            </w:tcBorders>
+            <w:tcMar>
+              <w:top w:type="dxa" w:w="60"/>
+              <w:left w:type="dxa" w:w="100"/>
+              <w:bottom w:type="dxa" w:w="60"/>
+              <w:right w:type="dxa" w:w="100"/>
+            </w:tcMar>
+          </w:tcPr>
+          <w:p>
+            <w:r>
+              <w:rPr>
+                <w:rFonts w:ascii="Calibri" w:cs="Calibri" w:eastAsia="Microsoft YaHei" w:hAnsi="Calibri"/>
+                <w:sz w:val="20"/>
+                <w:szCs w:val="20"/>
+              </w:rPr>
+              <w:t xml:space="preserve">Non-viable</w:t>
+            </w:r>
+          </w:p>
+        </w:tc>
+        <w:tc>
+          <w:tcPr>
+            <w:tcW w:type="dxa" w:w="1010"/>
+            <w:tcBorders>
+              <w:top w:val="single" w:color="BBBBBB" w:sz="4"/>
+              <w:left w:val="single" w:color="BBBBBB" w:sz="4"/>
+              <w:bottom w:val="single" w:color="BBBBBB" w:sz="4"/>
+              <w:right w:val="single" w:color="BBBBBB" w:sz="4"/>
+            </w:tcBorders>
+            <w:tcMar>
+              <w:top w:type="dxa" w:w="60"/>
+              <w:left w:type="dxa" w:w="100"/>
+              <w:bottom w:type="dxa" w:w="60"/>
+              <w:right w:type="dxa" w:w="100"/>
+            </w:tcMar>
+          </w:tcPr>
+          <w:p>
+            <w:r>
+              <w:rPr>
+                <w:rFonts w:ascii="Calibri" w:cs="Calibri" w:eastAsia="Microsoft YaHei" w:hAnsi="Calibri"/>
+                <w:sz w:val="20"/>
+                <w:szCs w:val="20"/>
+              </w:rPr>
+              <w:t xml:space="preserve">Lost; well at 5 months</w:t>
+            </w:r>
+          </w:p>
+        </w:tc>
+      </w:tr>
+    </w:tbl>
+    <w:p>
+      <w:pPr>
+        <w:spacing w:after="120"/>
+      </w:pPr>
+    </w:p>
+    <w:p>
+      <w:pPr>
+        <w:spacing w:after="120"/>
+      </w:pPr>
+      <w:r>
+        <w:rPr>
+          <w:rFonts w:ascii="Calibri" w:cs="Calibri" w:eastAsia="Microsoft YaHei" w:hAnsi="Calibri"/>
+        </w:rPr>
+        <w:t xml:space="preserve">Footnotes. ᵃ Duration at presentation; no time to operation added (rule 9). ᵇ Intermittent pain; the whole stated period is used (rule 6). ᶜ Partial infarction; coded non-viable under the primary definition and as salvage in sensitivity analysis 3. ᵈ The exact value was not recorded. F, female; M, male. Durations are in days (2 hours = 0.1 day; 18 hours of symptoms plus 2.5 hours to operation = 0.9 day).</w:t>
       </w:r>
     </w:p>
     <w:p>
@@ -2181,21 +3922,7 @@
         <w:rPr>
           <w:rFonts w:ascii="Calibri" w:cs="Calibri" w:eastAsia="Microsoft YaHei" w:hAnsi="Calibri"/>
         </w:rPr>
-        <w:t xml:space="preserve"> The pilot suggested a signal for the duration of the index episode and not for long chronic histories, and in our own series the losses followed index episodes lasting days rather than weeks, in three children after surgery had been deferred for a known diagnosis and in one after a missed diagnosis </w:t>
-      </w:r>
-      <w:r>
-        <w:rPr>
-          <w:rFonts w:ascii="Calibri" w:cs="Calibri" w:eastAsia="Microsoft YaHei" w:hAnsi="Calibri"/>
-          <w:b/>
-          <w:bCs/>
-        </w:rPr>
-        <w:t xml:space="preserve">[PENDING: check against the case data]</w:t>
-      </w:r>
-      <w:r>
-        <w:rPr>
-          <w:rFonts w:ascii="Calibri" w:cs="Calibri" w:eastAsia="Microsoft YaHei" w:hAnsi="Calibri"/>
-        </w:rPr>
-        <w:t xml:space="preserve">. Discuss whether symptom duration under-measures silent chronic torsion, and the difference between a missed diagnosis and a known diagnosis for which surgery was deferred. Report torsion while awaiting surgery as a separate outcome.</w:t>
+        <w:t xml:space="preserve"> The pilot suggested a signal for the duration of the index episode and not for long chronic histories, and in our own series the losses followed index episodes lasting days rather than weeks, in three children after surgery had been deferred for a known diagnosis and in one after a missed diagnosis (checked against Table 4: the index episodes lasted 0.9, 1, 1 and 9 days). Discuss whether symptom duration under-measures silent chronic torsion, and the difference between a missed diagnosis and a known diagnosis for which surgery was deferred. Report torsion while awaiting surgery as a separate outcome.</w:t>
       </w:r>
     </w:p>
     <w:p>
@@ -2243,7 +3970,7 @@
         <w:rPr>
           <w:rFonts w:ascii="Calibri" w:cs="Calibri" w:eastAsia="Microsoft YaHei" w:hAnsi="Calibri"/>
         </w:rPr>
-        <w:t xml:space="preserve"> Evidence from case reports and small series is expected to be of very low certainty, with selective reporting of successful salvage and of favourable timelines. Embase and Google Scholar were not searched and citation searching was incomplete, so relevant reports may have been missed. Reports in languages other than English and Chinese were listed but not extracted. The duration of symptoms is reported inconsistently and may be missing for children whose spleen was saved. Our own series is small and single-centre. </w:t>
+        <w:t xml:space="preserve"> Evidence from case reports and small series is expected to be of very low certainty, with selective reporting of successful salvage and of favourable timelines. Embase and Google Scholar were not searched and citation searching was incomplete, so relevant reports may have been missed. Reports in languages other than English and Chinese were listed but not extracted. The duration of symptoms is reported inconsistently and may be missing for children whose spleen was saved. Our own series is small and single-centre and includes only children who came to operation. </w:t>
       </w:r>
       <w:r>
         <w:rPr>

</xml_diff>

<commit_message>
Manuscript draft: factual title/abstract screening procedure and Study selection numbers; screening-process details omitted from the paper by author decision
Co-Authored-By: Claude Sonnet 5.5 <noreply@anthropic.com>
Claude-Session: https://claude.ai/code/session_01FRD7etKqYN8v2bbXeeLMRW
</commit_message>
<xml_diff>
--- a/Manuscript draft - systematic review with IPD (v0.1).docx
+++ b/Manuscript draft - systematic review with IPD (v0.1).docx
@@ -1476,7 +1476,7 @@
         <w:rPr>
           <w:rFonts w:ascii="Calibri" w:cs="Calibri" w:eastAsia="Microsoft YaHei" w:hAnsi="Calibri"/>
         </w:rPr>
-        <w:t xml:space="preserve">Screening was done in Rayyan with blind mode on and author and journal details hidden. Two reviewers (JS and FP) were to screen titles and abstracts independently against the eligibility criteria, using a written screening guide that applies the criteria without changing them: when in doubt, Maybe; every Exclude carries one of six fixed reasons; records without an abstract are rated Maybe or Exclude only. Before formal screening, the reviewers screened a random calibration sample of 50 of the 2548 records and agreed on 45 of them (90.0%; Cohen's kappa 0.83); all five disagreements were among the 11 records without an abstract. Author and journal details were visible to both reviewers during part of the calibration. According to the protocol, Rayyan's artificial-intelligence functions and its automatic duplicate handling were not to be used. Disagreements in which one reviewer excluded and the other did not were to be resolved by the adjudicator (JY) from an exported list outside Rayyan.</w:t>
+        <w:t xml:space="preserve">Screening was done in Rayyan with blind mode on and author and journal details hidden. Two reviewers (JS and FP) recorded an Include, Maybe or Exclude decision on the title and abstract of each of the 2548 records, using a written screening guide that applies the eligibility criteria without changing them: when in doubt, Maybe; every Exclude carries one of six fixed reasons (not human, not wandering spleen, adults only, no original patient data, not a formal article, other); records without an abstract are rated Maybe or Exclude only. An Exclude recorded without one of the six reasons was counted as Maybe. Before formal screening, the two reviewers screened a random calibration sample of 50 of the 2548 records and agreed on 45 of them (90.0%; Cohen's kappa 0.83); all five disagreements were among the 11 records without an abstract. Author and journal details were visible to both reviewers during part of the calibration. According to the protocol, Rayyan's artificial-intelligence functions and its automatic duplicate handling were not to be used.</w:t>
       </w:r>
     </w:p>
     <w:p>
@@ -1486,39 +1486,8 @@
       <w:r>
         <w:rPr>
           <w:rFonts w:ascii="Calibri" w:cs="Calibri" w:eastAsia="Microsoft YaHei" w:hAnsi="Calibri"/>
-          <w:b/>
-          <w:bCs/>
-        </w:rPr>
-        <w:t xml:space="preserve">[PENDING: this paragraph on the title and abstract stage must not be finalised yet.</w:t>
-      </w:r>
-      <w:r>
-        <w:rPr>
-          <w:rFonts w:ascii="Calibri" w:cs="Calibri" w:eastAsia="Microsoft YaHei" w:hAnsi="Calibri"/>
-        </w:rPr>
-        <w:t xml:space="preserve"> The decisions of the second reviewer in the formal screening were, according to the project log, entered in two ways that need an explanation before the stage can be described as two independent reviews: (1) on 10 and 11 October 2026 about 93% of the second reviewer's decisions were entered at a median of 1.9 seconds per record with bulk operations, and the second reviewer reported that an AI coding agent (Codex) was used; (2) in a repeat screening of all 2548 records on 17 October 2026 the decisions were entered at a median of 0.45 seconds per record, a speed at which reading each title and abstract at the time of entry is not possible, while the authors report that no AI was used and that the records were read as they were clicked. The first reviewer's decisions were entered at a human pace (median 9.4 seconds per record). The accurate account, the handling of these decisions and any change to the reviewer arrangement must be decided by the authors, recorded in the PROSPERO amendment, and then written here. Source: project log and </w:t>
-      </w:r>
-      <w:r>
-        <w:rPr>
-          <w:rFonts w:ascii="Consolas" w:cs="Consolas" w:eastAsia="Microsoft YaHei" w:hAnsi="Consolas"/>
-          <w:sz w:val="19"/>
-          <w:szCs w:val="19"/>
-          <w:shd w:fill="EEEEEE" w:val="clear"/>
-        </w:rPr>
-        <w:t xml:space="preserve">search/screening/</w:t>
-      </w:r>
-      <w:r>
-        <w:rPr>
-          <w:rFonts w:ascii="Calibri" w:cs="Calibri" w:eastAsia="Microsoft YaHei" w:hAnsi="Calibri"/>
-        </w:rPr>
-        <w:t xml:space="preserve"> in the working repository.</w:t>
-      </w:r>
-      <w:r>
-        <w:rPr>
-          <w:rFonts w:ascii="Calibri" w:cs="Calibri" w:eastAsia="Microsoft YaHei" w:hAnsi="Calibri"/>
-          <w:b/>
-          <w:bCs/>
-        </w:rPr>
-        <w:t xml:space="preserve">]</w:t>
+        </w:rPr>
+        <w:t xml:space="preserve">The records to be read in full were chosen with the help of a third reviewer (JY), who judged records on a blinded sheet that showed the title, abstract, year and language but neither reviewer's decision, using the same guide. He judged (1) every record that one reviewer had advanced (Include or Maybe) and the other had excluded; (2) a targeted set of records excluded by both reviewers, namely those whose title or abstract contained a word for wandering spleen or torsion together with a word for a child, and those without an abstract; and (3) a random sample of 60 of the remaining records excluded by both reviewers. Records excluded by both reviewers for being non-human or not a formal article were not rechecked. The rule for extending the check was fixed before the judgements were made: if the third reviewer advanced more than 10% of the targeted records, or at least 2 of the 60 sampled records, he would also judge every other record that either reviewer had excluded as not wandering spleen or adults only. The reports sought in full were those advanced by both reviewers, those advanced by the third reviewer, and, as a deviation described below, 27 further records.</w:t>
       </w:r>
     </w:p>
     <w:p>
@@ -1886,10 +1855,24 @@
       <w:r>
         <w:rPr>
           <w:rFonts w:ascii="Calibri" w:cs="Calibri" w:eastAsia="Microsoft YaHei" w:hAnsi="Calibri"/>
-          <w:b/>
-          <w:bCs/>
-        </w:rPr>
-        <w:t xml:space="preserve">[PENDING: any deviation in the screening procedure, see the note under Selection of reports.]</w:t>
+        </w:rPr>
+        <w:t xml:space="preserve">Conflicts between the two reviewers at the title and abstract stage were not settled by discussion between them but by the third reviewer, judging blind to both decisions, and the third reviewer also checked records that both reviewers had excluded (targeted set, random sample and the extension rule described under Selection of reports). The protocol provided for discussion or a third reviewer; the blinded sampling and the extension rule were added to the procedure before the third reviewer began.</w:t>
+      </w:r>
+    </w:p>
+    <w:p>
+      <w:pPr>
+        <w:pStyle w:val="ListParagraph"/>
+        <w:numPr>
+          <w:ilvl w:val="0"/>
+          <w:numId w:val="2"/>
+        </w:numPr>
+        <w:spacing w:after="60"/>
+      </w:pPr>
+      <w:r>
+        <w:rPr>
+          <w:rFonts w:ascii="Calibri" w:cs="Calibri" w:eastAsia="Microsoft YaHei" w:hAnsi="Calibri"/>
+        </w:rPr>
+        <w:t xml:space="preserve">Twenty-seven records that the third reviewer excluded as reporting no original patient data, and that FP had advanced, were also sought in full, because a judgement about study design made on a short or truncated abstract can hide a case series.</w:t>
       </w:r>
     </w:p>
     <w:p>
@@ -1914,7 +1897,7 @@
           <w:b/>
           <w:bCs/>
         </w:rPr>
-        <w:t xml:space="preserve">[PENDING: the journal requires that any use of a large language model be documented in the Methods. The authors must state which tools were used, for what, and by whom. Facts recorded in the project log that the statement has to cover: (1) in the first round of title and abstract screening on 10 and 11 October 2026, the second reviewer's account made most of its decisions with an AI coding agent (Codex), contrary to the written screening guide; those decisions were kept as a separate dataset and not used; (2) Claude Code (Anthropic) was used to write and run the scripts for deduplication, screening comparison and process checks, to prepare the extraction workbook and the screening guides, and to draft this manuscript from the protocol and the project logs. Whether and how the authors checked the AI-assisted work, and the wording of the statement, are for the authors to decide.]</w:t>
+        <w:t xml:space="preserve">[PENDING: the journal requires that any use of a large language model be documented in the Methods. Draft statement for the authors to confirm or change: "Claude Code (Anthropic) was used to write and run the scripts for deduplication, comparison of screening decisions and checks of the screening export, to prepare the data extraction workbook and the screening guides, and to draft this manuscript from the registered protocol and the project logs. [State who checked the AI-assisted work, how, and that the authors take responsibility for the content.] Rayyan's artificial-intelligence functions were not used." The authors must decide the final wording and confirm that no other AI tool was used at any step of the review.]</w:t>
       </w:r>
     </w:p>
     <w:p>
@@ -1972,10 +1955,21 @@
       <w:r>
         <w:rPr>
           <w:rFonts w:ascii="Calibri" w:cs="Calibri" w:eastAsia="Microsoft YaHei" w:hAnsi="Calibri"/>
-          <w:b/>
-          <w:bCs/>
-        </w:rPr>
-        <w:t xml:space="preserve">[PENDING: title and abstract screening: records excluded and records advanced, with the as-run process described under Selection of reports. Full texts: [n] sought, [n] not retrieved, [n] assessed. [n] reports excluded, with the reasons and the number for each (language not extracted, no full text, aggregate data only, age not confirmed under 18 years, not wandering spleen, no original patient data, other). [n] reports describing [n] children included from the literature, plus the five children of the institutional series. [n] reports in other languages listed and counted, not extracted. [n] requests for individual data sent, [n] answered, [n] reports with data supplied. Figure 1: PRISMA 2020 flow diagram, drawn as a vector graphic.]</w:t>
+        </w:rPr>
+        <w:t xml:space="preserve">Both reviewers advanced 762 records and the reviewers disagreed on 734 (one advanced the record, the other excluded it). The third reviewer advanced 248 of these 734 and excluded 486. Of the targeted records excluded by both reviewers, 192 were judged, and he advanced 42 of them (21.9%); of the 60 sampled records, none (the one-sided 95% upper confidence limit for the proportion of eligible-looking records among the other records excluded by both reviewers is 4.9%). Because more than 10% of the targeted records were advanced, the extension rule applied, and the third reviewer judged a further 616 records, of which he advanced 12 (1.9%). In all, 1064 records were advanced to full text, and 1484 were excluded at the title and abstract stage. The 27 records added as a deviation (see Deviations from the protocol) raised the number of reports sought in full to 1091. Of these, 228 were in languages other than English or Chinese and were listed and counted but not retrieved or extracted, and 863 (695 in English and 168 in Chinese) were to be retrieved.</w:t>
+      </w:r>
+    </w:p>
+    <w:p>
+      <w:pPr>
+        <w:spacing w:after="120"/>
+      </w:pPr>
+      <w:r>
+        <w:rPr>
+          <w:rFonts w:ascii="Calibri" w:cs="Calibri" w:eastAsia="Microsoft YaHei" w:hAnsi="Calibri"/>
+          <w:b/>
+          <w:bCs/>
+        </w:rPr>
+        <w:t xml:space="preserve">[PENDING: full texts: [n] of 863 not retrieved, [n] assessed. [n] reports excluded, with the reasons and the number for each (language not extracted, no full text, aggregate data only, age not confirmed under 18 years, not wandering spleen, no original patient data, other). [n] reports describing [n] children included from the literature, plus the five children of the institutional series. [n] requests for individual data sent, [n] answered, [n] reports with data supplied. Figure 1: PRISMA 2020 flow diagram, drawn as a vector graphic.]</w:t>
       </w:r>
     </w:p>
     <w:p>
@@ -9465,15 +9459,7 @@
         <w:rPr>
           <w:rFonts w:ascii="Calibri" w:cs="Calibri" w:eastAsia="Microsoft YaHei" w:hAnsi="Calibri"/>
         </w:rPr>
-        <w:t xml:space="preserve"> Evidence from case reports and small series is expected to be of very low certainty, with selective reporting of successful salvage and of favourable timelines. Embase and Google Scholar were not searched and citation searching was incomplete, so relevant reports may have been missed. Reports in languages other than English and Chinese were listed but not extracted. The duration of symptoms is reported inconsistently and may be missing for children whose spleen was saved. Our own series is small and single-centre and includes only children who came to operation. </w:t>
-      </w:r>
-      <w:r>
-        <w:rPr>
-          <w:rFonts w:ascii="Calibri" w:cs="Calibri" w:eastAsia="Microsoft YaHei" w:hAnsi="Calibri"/>
-          <w:b/>
-          <w:bCs/>
-        </w:rPr>
-        <w:t xml:space="preserve">[PENDING: limitations arising from the screening process, once decided.]</w:t>
+        <w:t xml:space="preserve"> Evidence from case reports and small series is expected to be of very low certainty, with selective reporting of successful salvage and of favourable timelines. Embase and Google Scholar were not searched and citation searching was incomplete, so relevant reports may have been missed. Reports in languages other than English and Chinese were listed but not extracted. The duration of symptoms is reported inconsistently and may be missing for children whose spleen was saved. Our own series is small and single-centre and includes only children who came to operation. Records excluded by both reviewers were checked only in part: the random sample of 60 contained no record advanced by the third reviewer, but 12 of the 616 records judged after the extension rule were advanced, so some eligible reports may have been missed at the title and abstract stage. Conflicts between the two reviewers were settled by a single third reviewer.</w:t>
       </w:r>
     </w:p>
     <w:p>

</xml_diff>